<commit_message>
Update as of 4th September 2026
Co-Authored-By: Claude Opus 5 <noreply@anthropic.com>
</commit_message>
<xml_diff>
--- a/public/info/Ing Ben Sackey.docx
+++ b/public/info/Ing Ben Sackey.docx
@@ -237,12 +237,37 @@
                           <w:szCs w:val="24"/>
                         </w:rPr>
                       </w:pPr>
-                      <w:r>
-                        <w:rPr>
-                          <w:sz w:val="24"/>
-                          <w:szCs w:val="24"/>
-                        </w:rPr>
-                        <w:t xml:space="preserve">Bsc, Msc, </w:t>
+                      <w:proofErr w:type="spellStart"/>
+                      <w:r>
+                        <w:rPr>
+                          <w:sz w:val="24"/>
+                          <w:szCs w:val="24"/>
+                        </w:rPr>
+                        <w:t>Bsc</w:t>
+                      </w:r>
+                      <w:proofErr w:type="spellEnd"/>
+                      <w:r>
+                        <w:rPr>
+                          <w:sz w:val="24"/>
+                          <w:szCs w:val="24"/>
+                        </w:rPr>
+                        <w:t xml:space="preserve">, </w:t>
+                      </w:r>
+                      <w:proofErr w:type="spellStart"/>
+                      <w:r>
+                        <w:rPr>
+                          <w:sz w:val="24"/>
+                          <w:szCs w:val="24"/>
+                        </w:rPr>
+                        <w:t>Msc</w:t>
+                      </w:r>
+                      <w:proofErr w:type="spellEnd"/>
+                      <w:r>
+                        <w:rPr>
+                          <w:sz w:val="24"/>
+                          <w:szCs w:val="24"/>
+                        </w:rPr>
+                        <w:t xml:space="preserve">, </w:t>
                       </w:r>
                       <w:r>
                         <w:rPr>
@@ -2777,6 +2802,7 @@
                           <w:bCs/>
                         </w:rPr>
                       </w:pPr>
+                      <w:proofErr w:type="spellStart"/>
                       <w:r>
                         <w:rPr>
                           <w:rFonts w:ascii="Arial Narrow" w:eastAsia="Times New Roman" w:hAnsi="Arial Narrow"/>
@@ -2785,8 +2811,9 @@
                           <w:szCs w:val="24"/>
                           <w:lang w:val="fr-FR" w:eastAsia="fr-FR"/>
                         </w:rPr>
-                        <w:t xml:space="preserve">Contract for the Design of the Accra -Tema Motorway and Extensions Project (27.7km) and Construction of Section 1 – Tema </w:t>
-                      </w:r>
+                        <w:t>Contract</w:t>
+                      </w:r>
+                      <w:proofErr w:type="spellEnd"/>
                       <w:r>
                         <w:rPr>
                           <w:rFonts w:ascii="Arial Narrow" w:eastAsia="Times New Roman" w:hAnsi="Arial Narrow"/>
@@ -2795,8 +2822,9 @@
                           <w:szCs w:val="24"/>
                           <w:lang w:val="fr-FR" w:eastAsia="fr-FR"/>
                         </w:rPr>
-                        <w:t>Round about</w:t>
-                      </w:r>
+                        <w:t xml:space="preserve"> for the Design of the Accra -Tema </w:t>
+                      </w:r>
+                      <w:proofErr w:type="spellStart"/>
                       <w:r>
                         <w:rPr>
                           <w:rFonts w:ascii="Arial Narrow" w:eastAsia="Times New Roman" w:hAnsi="Arial Narrow"/>
@@ -2805,8 +2833,9 @@
                           <w:szCs w:val="24"/>
                           <w:lang w:val="fr-FR" w:eastAsia="fr-FR"/>
                         </w:rPr>
-                        <w:t xml:space="preserve"> – Tetteh Quarshie Interchange (19.5km)</w:t>
-                      </w:r>
+                        <w:t>Motorway</w:t>
+                      </w:r>
+                      <w:proofErr w:type="spellEnd"/>
                       <w:r>
                         <w:rPr>
                           <w:rFonts w:ascii="Arial Narrow" w:eastAsia="Times New Roman" w:hAnsi="Arial Narrow"/>
@@ -2815,6 +2844,36 @@
                           <w:szCs w:val="24"/>
                           <w:lang w:val="fr-FR" w:eastAsia="fr-FR"/>
                         </w:rPr>
+                        <w:t xml:space="preserve"> and Extensions Project (27.7km) and Construction of Section 1 – Tema </w:t>
+                      </w:r>
+                      <w:r>
+                        <w:rPr>
+                          <w:rFonts w:ascii="Arial Narrow" w:eastAsia="Times New Roman" w:hAnsi="Arial Narrow"/>
+                          <w:b/>
+                          <w:sz w:val="24"/>
+                          <w:szCs w:val="24"/>
+                          <w:lang w:val="fr-FR" w:eastAsia="fr-FR"/>
+                        </w:rPr>
+                        <w:t>Round about</w:t>
+                      </w:r>
+                      <w:r>
+                        <w:rPr>
+                          <w:rFonts w:ascii="Arial Narrow" w:eastAsia="Times New Roman" w:hAnsi="Arial Narrow"/>
+                          <w:b/>
+                          <w:sz w:val="24"/>
+                          <w:szCs w:val="24"/>
+                          <w:lang w:val="fr-FR" w:eastAsia="fr-FR"/>
+                        </w:rPr>
+                        <w:t xml:space="preserve"> – Tetteh Quarshie Interchange (19.5km)</w:t>
+                      </w:r>
+                      <w:r>
+                        <w:rPr>
+                          <w:rFonts w:ascii="Arial Narrow" w:eastAsia="Times New Roman" w:hAnsi="Arial Narrow"/>
+                          <w:b/>
+                          <w:sz w:val="24"/>
+                          <w:szCs w:val="24"/>
+                          <w:lang w:val="fr-FR" w:eastAsia="fr-FR"/>
+                        </w:rPr>
                         <w:t xml:space="preserve"> </w:t>
                       </w:r>
                       <w:r>
@@ -2822,35 +2881,7 @@
                           <w:b/>
                           <w:bCs/>
                         </w:rPr>
-                        <w:t>Ghana (202</w:t>
-                      </w:r>
-                      <w:r>
-                        <w:rPr>
-                          <w:b/>
-                          <w:bCs/>
-                        </w:rPr>
-                        <w:t>4</w:t>
-                      </w:r>
-                      <w:r>
-                        <w:rPr>
-                          <w:b/>
-                          <w:bCs/>
-                        </w:rPr>
-                        <w:t xml:space="preserve"> – </w:t>
-                      </w:r>
-                      <w:r>
-                        <w:rPr>
-                          <w:b/>
-                          <w:bCs/>
-                        </w:rPr>
-                        <w:t>To date</w:t>
-                      </w:r>
-                      <w:r>
-                        <w:rPr>
-                          <w:b/>
-                          <w:bCs/>
-                        </w:rPr>
-                        <w:t>)</w:t>
+                        <w:t>Ghana (2024 – To date)</w:t>
                       </w:r>
                     </w:p>
                     <w:p>
@@ -3337,7 +3368,169 @@
                           <w:bCs/>
                           <w:lang w:val="fr-FR"/>
                         </w:rPr>
-                        <w:t>The Construction of an Administration Block, 2 - Storey Dormitory Block, 3-Storey Dormitory Block, Vice Principal’s Residence, Library Block, Staff Flats and External Works at J.A Kuffour Senior High Technical School, Darbaa in the Atwima Nwabiagya North District. Ghana (2022 -2023)</w:t>
+                        <w:t xml:space="preserve">The Construction of an Administration Block, 2 - Storey </w:t>
+                      </w:r>
+                      <w:proofErr w:type="spellStart"/>
+                      <w:r>
+                        <w:rPr>
+                          <w:b/>
+                          <w:bCs/>
+                          <w:lang w:val="fr-FR"/>
+                        </w:rPr>
+                        <w:t>Dormitory</w:t>
+                      </w:r>
+                      <w:proofErr w:type="spellEnd"/>
+                      <w:r>
+                        <w:rPr>
+                          <w:b/>
+                          <w:bCs/>
+                          <w:lang w:val="fr-FR"/>
+                        </w:rPr>
+                        <w:t xml:space="preserve"> Block, 3-Storey </w:t>
+                      </w:r>
+                      <w:proofErr w:type="spellStart"/>
+                      <w:r>
+                        <w:rPr>
+                          <w:b/>
+                          <w:bCs/>
+                          <w:lang w:val="fr-FR"/>
+                        </w:rPr>
+                        <w:t>Dormitory</w:t>
+                      </w:r>
+                      <w:proofErr w:type="spellEnd"/>
+                      <w:r>
+                        <w:rPr>
+                          <w:b/>
+                          <w:bCs/>
+                          <w:lang w:val="fr-FR"/>
+                        </w:rPr>
+                        <w:t xml:space="preserve"> Block, Vice </w:t>
+                      </w:r>
+                      <w:proofErr w:type="spellStart"/>
+                      <w:r>
+                        <w:rPr>
+                          <w:b/>
+                          <w:bCs/>
+                          <w:lang w:val="fr-FR"/>
+                        </w:rPr>
+                        <w:t>Principal’s</w:t>
+                      </w:r>
+                      <w:proofErr w:type="spellEnd"/>
+                      <w:r>
+                        <w:rPr>
+                          <w:b/>
+                          <w:bCs/>
+                          <w:lang w:val="fr-FR"/>
+                        </w:rPr>
+                        <w:t xml:space="preserve"> </w:t>
+                      </w:r>
+                      <w:proofErr w:type="spellStart"/>
+                      <w:r>
+                        <w:rPr>
+                          <w:b/>
+                          <w:bCs/>
+                          <w:lang w:val="fr-FR"/>
+                        </w:rPr>
+                        <w:t>Residence</w:t>
+                      </w:r>
+                      <w:proofErr w:type="spellEnd"/>
+                      <w:r>
+                        <w:rPr>
+                          <w:b/>
+                          <w:bCs/>
+                          <w:lang w:val="fr-FR"/>
+                        </w:rPr>
+                        <w:t xml:space="preserve">, Library Block, Staff Flats and </w:t>
+                      </w:r>
+                      <w:proofErr w:type="spellStart"/>
+                      <w:r>
+                        <w:rPr>
+                          <w:b/>
+                          <w:bCs/>
+                          <w:lang w:val="fr-FR"/>
+                        </w:rPr>
+                        <w:t>External</w:t>
+                      </w:r>
+                      <w:proofErr w:type="spellEnd"/>
+                      <w:r>
+                        <w:rPr>
+                          <w:b/>
+                          <w:bCs/>
+                          <w:lang w:val="fr-FR"/>
+                        </w:rPr>
+                        <w:t xml:space="preserve"> Works at J.A Kuffour Senior High </w:t>
+                      </w:r>
+                      <w:proofErr w:type="spellStart"/>
+                      <w:r>
+                        <w:rPr>
+                          <w:b/>
+                          <w:bCs/>
+                          <w:lang w:val="fr-FR"/>
+                        </w:rPr>
+                        <w:t>Technical</w:t>
+                      </w:r>
+                      <w:proofErr w:type="spellEnd"/>
+                      <w:r>
+                        <w:rPr>
+                          <w:b/>
+                          <w:bCs/>
+                          <w:lang w:val="fr-FR"/>
+                        </w:rPr>
+                        <w:t xml:space="preserve"> School, </w:t>
+                      </w:r>
+                      <w:proofErr w:type="spellStart"/>
+                      <w:r>
+                        <w:rPr>
+                          <w:b/>
+                          <w:bCs/>
+                          <w:lang w:val="fr-FR"/>
+                        </w:rPr>
+                        <w:t>Darbaa</w:t>
+                      </w:r>
+                      <w:proofErr w:type="spellEnd"/>
+                      <w:r>
+                        <w:rPr>
+                          <w:b/>
+                          <w:bCs/>
+                          <w:lang w:val="fr-FR"/>
+                        </w:rPr>
+                        <w:t xml:space="preserve"> in the </w:t>
+                      </w:r>
+                      <w:proofErr w:type="spellStart"/>
+                      <w:r>
+                        <w:rPr>
+                          <w:b/>
+                          <w:bCs/>
+                          <w:lang w:val="fr-FR"/>
+                        </w:rPr>
+                        <w:t>Atwima</w:t>
+                      </w:r>
+                      <w:proofErr w:type="spellEnd"/>
+                      <w:r>
+                        <w:rPr>
+                          <w:b/>
+                          <w:bCs/>
+                          <w:lang w:val="fr-FR"/>
+                        </w:rPr>
+                        <w:t xml:space="preserve"> </w:t>
+                      </w:r>
+                      <w:proofErr w:type="spellStart"/>
+                      <w:r>
+                        <w:rPr>
+                          <w:b/>
+                          <w:bCs/>
+                          <w:lang w:val="fr-FR"/>
+                        </w:rPr>
+                        <w:t>Nwabiagya</w:t>
+                      </w:r>
+                      <w:proofErr w:type="spellEnd"/>
+                      <w:r>
+                        <w:rPr>
+                          <w:b/>
+                          <w:bCs/>
+                          <w:lang w:val="fr-FR"/>
+                        </w:rPr>
+                        <w:t xml:space="preserve"> North District. Ghana (2022 -2023)</w:t>
                       </w:r>
                     </w:p>
                     <w:p/>
@@ -4040,15 +4233,15 @@
         <mc:AlternateContent>
           <mc:Choice Requires="wps">
             <w:drawing>
-              <wp:anchor distT="45720" distB="45720" distL="114300" distR="114300" simplePos="0" relativeHeight="251723776" behindDoc="0" locked="1" layoutInCell="1" allowOverlap="1" wp14:anchorId="0CFCAED2" wp14:editId="17A81F4B">
+              <wp:anchor distT="45720" distB="45720" distL="114300" distR="114300" simplePos="0" relativeHeight="251723776" behindDoc="0" locked="1" layoutInCell="1" allowOverlap="1" wp14:anchorId="0CFCAED2" wp14:editId="530F82E4">
                 <wp:simplePos x="0" y="0"/>
                 <wp:positionH relativeFrom="page">
-                  <wp:align>left</wp:align>
+                  <wp:posOffset>266700</wp:posOffset>
                 </wp:positionH>
                 <wp:positionV relativeFrom="margin">
-                  <wp:align>top</wp:align>
+                  <wp:posOffset>53340</wp:posOffset>
                 </wp:positionV>
-                <wp:extent cx="2385060" cy="8100060"/>
+                <wp:extent cx="2118360" cy="9555480"/>
                 <wp:effectExtent l="0" t="0" r="0" b="0"/>
                 <wp:wrapSquare wrapText="bothSides"/>
                 <wp:docPr id="290659306" name="Text Box 290659306"/>
@@ -4064,7 +4257,7 @@
                       <wps:spPr bwMode="auto">
                         <a:xfrm>
                           <a:off x="0" y="0"/>
-                          <a:ext cx="2385060" cy="8100060"/>
+                          <a:ext cx="2118360" cy="9555480"/>
                         </a:xfrm>
                         <a:prstGeom prst="rect">
                           <a:avLst/>
@@ -4637,7 +4830,7 @@
           </mc:Choice>
           <mc:Fallback>
             <w:pict>
-              <v:shape w14:anchorId="0CFCAED2" id="Text Box 290659306" o:spid="_x0000_s1033" type="#_x0000_t202" style="position:absolute;left:0;text-align:left;margin-left:0;margin-top:0;width:187.8pt;height:637.8pt;z-index:251723776;visibility:visible;mso-wrap-style:square;mso-width-percent:0;mso-height-percent:0;mso-wrap-distance-left:9pt;mso-wrap-distance-top:3.6pt;mso-wrap-distance-right:9pt;mso-wrap-distance-bottom:3.6pt;mso-position-horizontal:left;mso-position-horizontal-relative:page;mso-position-vertical:top;mso-position-vertical-relative:margin;mso-width-percent:0;mso-height-percent:0;mso-width-relative:margin;mso-height-relative:margin;v-text-anchor:top" o:gfxdata="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" filled="f" stroked="f">
+              <v:shape w14:anchorId="0CFCAED2" id="Text Box 290659306" o:spid="_x0000_s1033" type="#_x0000_t202" style="position:absolute;left:0;text-align:left;margin-left:21pt;margin-top:4.2pt;width:166.8pt;height:752.4pt;z-index:251723776;visibility:visible;mso-wrap-style:square;mso-width-percent:0;mso-height-percent:0;mso-wrap-distance-left:9pt;mso-wrap-distance-top:3.6pt;mso-wrap-distance-right:9pt;mso-wrap-distance-bottom:3.6pt;mso-position-horizontal:absolute;mso-position-horizontal-relative:page;mso-position-vertical:absolute;mso-position-vertical-relative:margin;mso-width-percent:0;mso-height-percent:0;mso-width-relative:margin;mso-height-relative:margin;v-text-anchor:top" o:gfxdata="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" filled="f" stroked="f">
                 <v:textbox>
                   <w:txbxContent>
                     <w:p>
@@ -4756,12 +4949,21 @@
                         </w:rPr>
                         <w:t xml:space="preserve">: </w:t>
                       </w:r>
+                      <w:proofErr w:type="spellStart"/>
                       <w:r>
                         <w:rPr>
                           <w:szCs w:val="22"/>
                           <w:lang w:val="fr-FR"/>
                         </w:rPr>
-                        <w:t>Transtech Consult Limited/ Louis Berger SAS France</w:t>
+                        <w:t>Transtech</w:t>
+                      </w:r>
+                      <w:proofErr w:type="spellEnd"/>
+                      <w:r>
+                        <w:rPr>
+                          <w:szCs w:val="22"/>
+                          <w:lang w:val="fr-FR"/>
+                        </w:rPr>
+                        <w:t xml:space="preserve"> Consult Limited/ Louis Berger SAS France</w:t>
                       </w:r>
                     </w:p>
                     <w:p>
@@ -5105,35 +5307,21 @@
                           <w:b/>
                           <w:bCs/>
                         </w:rPr>
-                        <w:t>0</w:t>
+                        <w:t>00</w:t>
                       </w:r>
                       <w:r>
                         <w:rPr>
                           <w:b/>
                           <w:bCs/>
                         </w:rPr>
-                        <w:t>0</w:t>
+                        <w:t xml:space="preserve"> – 20</w:t>
                       </w:r>
                       <w:r>
                         <w:rPr>
                           <w:b/>
                           <w:bCs/>
                         </w:rPr>
-                        <w:t xml:space="preserve"> – 20</w:t>
-                      </w:r>
-                      <w:r>
-                        <w:rPr>
-                          <w:b/>
-                          <w:bCs/>
-                        </w:rPr>
-                        <w:t>0</w:t>
-                      </w:r>
-                      <w:r>
-                        <w:rPr>
-                          <w:b/>
-                          <w:bCs/>
-                        </w:rPr>
-                        <w:t>1</w:t>
+                        <w:t>01</w:t>
                       </w:r>
                       <w:r>
                         <w:t xml:space="preserve">: </w:t>
@@ -5170,10 +5358,7 @@
                         <w:jc w:val="left"/>
                       </w:pPr>
                       <w:r>
-                        <w:t xml:space="preserve">Graduate Teacher (National Service) </w:t>
-                      </w:r>
-                      <w:r>
-                        <w:t>-Ghana</w:t>
+                        <w:t>Graduate Teacher (National Service) -Ghana</w:t>
                       </w:r>
                     </w:p>
                     <w:p>
@@ -7382,6 +7567,7 @@
                           <w:lang w:val="fr-FR" w:eastAsia="fr-FR"/>
                         </w:rPr>
                       </w:pPr>
+                      <w:proofErr w:type="spellStart"/>
                       <w:r>
                         <w:rPr>
                           <w:rFonts w:ascii="Arial Narrow" w:eastAsia="Times New Roman" w:hAnsi="Arial Narrow"/>
@@ -7391,7 +7577,43 @@
                           <w:szCs w:val="24"/>
                           <w:lang w:val="fr-FR" w:eastAsia="fr-FR"/>
                         </w:rPr>
-                        <w:t>Asphaltic Overlay of Selected Streets in Accra Phase II (120km),</w:t>
+                        <w:t>Asphaltic</w:t>
+                      </w:r>
+                      <w:proofErr w:type="spellEnd"/>
+                      <w:r>
+                        <w:rPr>
+                          <w:rFonts w:ascii="Arial Narrow" w:eastAsia="Times New Roman" w:hAnsi="Arial Narrow"/>
+                          <w:b/>
+                          <w:bCs/>
+                          <w:sz w:val="24"/>
+                          <w:szCs w:val="24"/>
+                          <w:lang w:val="fr-FR" w:eastAsia="fr-FR"/>
+                        </w:rPr>
+                        <w:t xml:space="preserve"> Overlay of </w:t>
+                      </w:r>
+                      <w:proofErr w:type="spellStart"/>
+                      <w:r>
+                        <w:rPr>
+                          <w:rFonts w:ascii="Arial Narrow" w:eastAsia="Times New Roman" w:hAnsi="Arial Narrow"/>
+                          <w:b/>
+                          <w:bCs/>
+                          <w:sz w:val="24"/>
+                          <w:szCs w:val="24"/>
+                          <w:lang w:val="fr-FR" w:eastAsia="fr-FR"/>
+                        </w:rPr>
+                        <w:t>Selected</w:t>
+                      </w:r>
+                      <w:proofErr w:type="spellEnd"/>
+                      <w:r>
+                        <w:rPr>
+                          <w:rFonts w:ascii="Arial Narrow" w:eastAsia="Times New Roman" w:hAnsi="Arial Narrow"/>
+                          <w:b/>
+                          <w:bCs/>
+                          <w:sz w:val="24"/>
+                          <w:szCs w:val="24"/>
+                          <w:lang w:val="fr-FR" w:eastAsia="fr-FR"/>
+                        </w:rPr>
+                        <w:t xml:space="preserve"> Streets in Accra Phase II (120km),</w:t>
                       </w:r>
                     </w:p>
                     <w:p>
@@ -7466,8 +7688,21 @@
                           <w:szCs w:val="24"/>
                           <w:lang w:val="fr-FR" w:eastAsia="fr-FR"/>
                         </w:rPr>
-                        <w:t>Consulting Resident Engineer</w:t>
-                      </w:r>
+                        <w:t xml:space="preserve">Consulting Resident </w:t>
+                      </w:r>
+                      <w:proofErr w:type="spellStart"/>
+                      <w:r>
+                        <w:rPr>
+                          <w:rFonts w:ascii="Arial Narrow" w:eastAsia="Times New Roman" w:hAnsi="Arial Narrow" w:cs="Times New Roman"/>
+                          <w:b/>
+                          <w:bCs/>
+                          <w:sz w:val="24"/>
+                          <w:szCs w:val="24"/>
+                          <w:lang w:val="fr-FR" w:eastAsia="fr-FR"/>
+                        </w:rPr>
+                        <w:t>Engineer</w:t>
+                      </w:r>
+                      <w:proofErr w:type="spellEnd"/>
                     </w:p>
                     <w:p>
                       <w:pPr>
@@ -7490,8 +7725,1059 @@
                           <w:szCs w:val="24"/>
                           <w:lang w:val="fr-FR" w:eastAsia="fr-FR"/>
                         </w:rPr>
-                        <w:t>As the Resident Engineer to the Project am responsible for design review and contract administration of the project. Am Responsible and involved in the review of cost estimates, modification of designs, standardization of quality control. I developed and in charge of procedures, Certification and Payment. I was monitoring and supervising contractor’s site works. Coordinating with the team Leader in the discharge of his duties. Supervising engineers &amp; Technicians. Involved in the Designs, Contract documentation, Evaluation and awards. Directly Involved in the Site Supervision for the asphalt Overlay. Reviewing the Contractor’s operations and construction planning.  Preparing and approving IPCs inconjunction with the Quantity Surveyor. Chairing Meetings and organising monthly management meetings with stakeholders. Undertaking Site Monitoring and Supervision and issuing design changes and site instructions. Preparation and submission of monthly progress</w:t>
-                      </w:r>
+                        <w:t xml:space="preserve">As the Resident </w:t>
+                      </w:r>
+                      <w:proofErr w:type="spellStart"/>
+                      <w:r>
+                        <w:rPr>
+                          <w:rFonts w:ascii="Arial Narrow" w:eastAsia="Times New Roman" w:hAnsi="Arial Narrow" w:cs="Times New Roman"/>
+                          <w:sz w:val="24"/>
+                          <w:szCs w:val="24"/>
+                          <w:lang w:val="fr-FR" w:eastAsia="fr-FR"/>
+                        </w:rPr>
+                        <w:t>Engineer</w:t>
+                      </w:r>
+                      <w:proofErr w:type="spellEnd"/>
+                      <w:r>
+                        <w:rPr>
+                          <w:rFonts w:ascii="Arial Narrow" w:eastAsia="Times New Roman" w:hAnsi="Arial Narrow" w:cs="Times New Roman"/>
+                          <w:sz w:val="24"/>
+                          <w:szCs w:val="24"/>
+                          <w:lang w:val="fr-FR" w:eastAsia="fr-FR"/>
+                        </w:rPr>
+                        <w:t xml:space="preserve"> to the Project </w:t>
+                      </w:r>
+                      <w:proofErr w:type="spellStart"/>
+                      <w:r>
+                        <w:rPr>
+                          <w:rFonts w:ascii="Arial Narrow" w:eastAsia="Times New Roman" w:hAnsi="Arial Narrow" w:cs="Times New Roman"/>
+                          <w:sz w:val="24"/>
+                          <w:szCs w:val="24"/>
+                          <w:lang w:val="fr-FR" w:eastAsia="fr-FR"/>
+                        </w:rPr>
+                        <w:t>am</w:t>
+                      </w:r>
+                      <w:proofErr w:type="spellEnd"/>
+                      <w:r>
+                        <w:rPr>
+                          <w:rFonts w:ascii="Arial Narrow" w:eastAsia="Times New Roman" w:hAnsi="Arial Narrow" w:cs="Times New Roman"/>
+                          <w:sz w:val="24"/>
+                          <w:szCs w:val="24"/>
+                          <w:lang w:val="fr-FR" w:eastAsia="fr-FR"/>
+                        </w:rPr>
+                        <w:t xml:space="preserve"> </w:t>
+                      </w:r>
+                      <w:proofErr w:type="spellStart"/>
+                      <w:r>
+                        <w:rPr>
+                          <w:rFonts w:ascii="Arial Narrow" w:eastAsia="Times New Roman" w:hAnsi="Arial Narrow" w:cs="Times New Roman"/>
+                          <w:sz w:val="24"/>
+                          <w:szCs w:val="24"/>
+                          <w:lang w:val="fr-FR" w:eastAsia="fr-FR"/>
+                        </w:rPr>
+                        <w:t>responsible</w:t>
+                      </w:r>
+                      <w:proofErr w:type="spellEnd"/>
+                      <w:r>
+                        <w:rPr>
+                          <w:rFonts w:ascii="Arial Narrow" w:eastAsia="Times New Roman" w:hAnsi="Arial Narrow" w:cs="Times New Roman"/>
+                          <w:sz w:val="24"/>
+                          <w:szCs w:val="24"/>
+                          <w:lang w:val="fr-FR" w:eastAsia="fr-FR"/>
+                        </w:rPr>
+                        <w:t xml:space="preserve"> for design </w:t>
+                      </w:r>
+                      <w:proofErr w:type="spellStart"/>
+                      <w:r>
+                        <w:rPr>
+                          <w:rFonts w:ascii="Arial Narrow" w:eastAsia="Times New Roman" w:hAnsi="Arial Narrow" w:cs="Times New Roman"/>
+                          <w:sz w:val="24"/>
+                          <w:szCs w:val="24"/>
+                          <w:lang w:val="fr-FR" w:eastAsia="fr-FR"/>
+                        </w:rPr>
+                        <w:t>review</w:t>
+                      </w:r>
+                      <w:proofErr w:type="spellEnd"/>
+                      <w:r>
+                        <w:rPr>
+                          <w:rFonts w:ascii="Arial Narrow" w:eastAsia="Times New Roman" w:hAnsi="Arial Narrow" w:cs="Times New Roman"/>
+                          <w:sz w:val="24"/>
+                          <w:szCs w:val="24"/>
+                          <w:lang w:val="fr-FR" w:eastAsia="fr-FR"/>
+                        </w:rPr>
+                        <w:t xml:space="preserve"> and </w:t>
+                      </w:r>
+                      <w:proofErr w:type="spellStart"/>
+                      <w:r>
+                        <w:rPr>
+                          <w:rFonts w:ascii="Arial Narrow" w:eastAsia="Times New Roman" w:hAnsi="Arial Narrow" w:cs="Times New Roman"/>
+                          <w:sz w:val="24"/>
+                          <w:szCs w:val="24"/>
+                          <w:lang w:val="fr-FR" w:eastAsia="fr-FR"/>
+                        </w:rPr>
+                        <w:t>contract</w:t>
+                      </w:r>
+                      <w:proofErr w:type="spellEnd"/>
+                      <w:r>
+                        <w:rPr>
+                          <w:rFonts w:ascii="Arial Narrow" w:eastAsia="Times New Roman" w:hAnsi="Arial Narrow" w:cs="Times New Roman"/>
+                          <w:sz w:val="24"/>
+                          <w:szCs w:val="24"/>
+                          <w:lang w:val="fr-FR" w:eastAsia="fr-FR"/>
+                        </w:rPr>
+                        <w:t xml:space="preserve"> administration of the </w:t>
+                      </w:r>
+                      <w:proofErr w:type="spellStart"/>
+                      <w:r>
+                        <w:rPr>
+                          <w:rFonts w:ascii="Arial Narrow" w:eastAsia="Times New Roman" w:hAnsi="Arial Narrow" w:cs="Times New Roman"/>
+                          <w:sz w:val="24"/>
+                          <w:szCs w:val="24"/>
+                          <w:lang w:val="fr-FR" w:eastAsia="fr-FR"/>
+                        </w:rPr>
+                        <w:t>project</w:t>
+                      </w:r>
+                      <w:proofErr w:type="spellEnd"/>
+                      <w:r>
+                        <w:rPr>
+                          <w:rFonts w:ascii="Arial Narrow" w:eastAsia="Times New Roman" w:hAnsi="Arial Narrow" w:cs="Times New Roman"/>
+                          <w:sz w:val="24"/>
+                          <w:szCs w:val="24"/>
+                          <w:lang w:val="fr-FR" w:eastAsia="fr-FR"/>
+                        </w:rPr>
+                        <w:t xml:space="preserve">. Am </w:t>
+                      </w:r>
+                      <w:proofErr w:type="spellStart"/>
+                      <w:r>
+                        <w:rPr>
+                          <w:rFonts w:ascii="Arial Narrow" w:eastAsia="Times New Roman" w:hAnsi="Arial Narrow" w:cs="Times New Roman"/>
+                          <w:sz w:val="24"/>
+                          <w:szCs w:val="24"/>
+                          <w:lang w:val="fr-FR" w:eastAsia="fr-FR"/>
+                        </w:rPr>
+                        <w:t>Responsible</w:t>
+                      </w:r>
+                      <w:proofErr w:type="spellEnd"/>
+                      <w:r>
+                        <w:rPr>
+                          <w:rFonts w:ascii="Arial Narrow" w:eastAsia="Times New Roman" w:hAnsi="Arial Narrow" w:cs="Times New Roman"/>
+                          <w:sz w:val="24"/>
+                          <w:szCs w:val="24"/>
+                          <w:lang w:val="fr-FR" w:eastAsia="fr-FR"/>
+                        </w:rPr>
+                        <w:t xml:space="preserve"> and </w:t>
+                      </w:r>
+                      <w:proofErr w:type="spellStart"/>
+                      <w:r>
+                        <w:rPr>
+                          <w:rFonts w:ascii="Arial Narrow" w:eastAsia="Times New Roman" w:hAnsi="Arial Narrow" w:cs="Times New Roman"/>
+                          <w:sz w:val="24"/>
+                          <w:szCs w:val="24"/>
+                          <w:lang w:val="fr-FR" w:eastAsia="fr-FR"/>
+                        </w:rPr>
+                        <w:t>involved</w:t>
+                      </w:r>
+                      <w:proofErr w:type="spellEnd"/>
+                      <w:r>
+                        <w:rPr>
+                          <w:rFonts w:ascii="Arial Narrow" w:eastAsia="Times New Roman" w:hAnsi="Arial Narrow" w:cs="Times New Roman"/>
+                          <w:sz w:val="24"/>
+                          <w:szCs w:val="24"/>
+                          <w:lang w:val="fr-FR" w:eastAsia="fr-FR"/>
+                        </w:rPr>
+                        <w:t xml:space="preserve"> in the </w:t>
+                      </w:r>
+                      <w:proofErr w:type="spellStart"/>
+                      <w:r>
+                        <w:rPr>
+                          <w:rFonts w:ascii="Arial Narrow" w:eastAsia="Times New Roman" w:hAnsi="Arial Narrow" w:cs="Times New Roman"/>
+                          <w:sz w:val="24"/>
+                          <w:szCs w:val="24"/>
+                          <w:lang w:val="fr-FR" w:eastAsia="fr-FR"/>
+                        </w:rPr>
+                        <w:t>review</w:t>
+                      </w:r>
+                      <w:proofErr w:type="spellEnd"/>
+                      <w:r>
+                        <w:rPr>
+                          <w:rFonts w:ascii="Arial Narrow" w:eastAsia="Times New Roman" w:hAnsi="Arial Narrow" w:cs="Times New Roman"/>
+                          <w:sz w:val="24"/>
+                          <w:szCs w:val="24"/>
+                          <w:lang w:val="fr-FR" w:eastAsia="fr-FR"/>
+                        </w:rPr>
+                        <w:t xml:space="preserve"> of </w:t>
+                      </w:r>
+                      <w:proofErr w:type="spellStart"/>
+                      <w:r>
+                        <w:rPr>
+                          <w:rFonts w:ascii="Arial Narrow" w:eastAsia="Times New Roman" w:hAnsi="Arial Narrow" w:cs="Times New Roman"/>
+                          <w:sz w:val="24"/>
+                          <w:szCs w:val="24"/>
+                          <w:lang w:val="fr-FR" w:eastAsia="fr-FR"/>
+                        </w:rPr>
+                        <w:t>cost</w:t>
+                      </w:r>
+                      <w:proofErr w:type="spellEnd"/>
+                      <w:r>
+                        <w:rPr>
+                          <w:rFonts w:ascii="Arial Narrow" w:eastAsia="Times New Roman" w:hAnsi="Arial Narrow" w:cs="Times New Roman"/>
+                          <w:sz w:val="24"/>
+                          <w:szCs w:val="24"/>
+                          <w:lang w:val="fr-FR" w:eastAsia="fr-FR"/>
+                        </w:rPr>
+                        <w:t xml:space="preserve"> </w:t>
+                      </w:r>
+                      <w:proofErr w:type="spellStart"/>
+                      <w:r>
+                        <w:rPr>
+                          <w:rFonts w:ascii="Arial Narrow" w:eastAsia="Times New Roman" w:hAnsi="Arial Narrow" w:cs="Times New Roman"/>
+                          <w:sz w:val="24"/>
+                          <w:szCs w:val="24"/>
+                          <w:lang w:val="fr-FR" w:eastAsia="fr-FR"/>
+                        </w:rPr>
+                        <w:t>estimates</w:t>
+                      </w:r>
+                      <w:proofErr w:type="spellEnd"/>
+                      <w:r>
+                        <w:rPr>
+                          <w:rFonts w:ascii="Arial Narrow" w:eastAsia="Times New Roman" w:hAnsi="Arial Narrow" w:cs="Times New Roman"/>
+                          <w:sz w:val="24"/>
+                          <w:szCs w:val="24"/>
+                          <w:lang w:val="fr-FR" w:eastAsia="fr-FR"/>
+                        </w:rPr>
+                        <w:t xml:space="preserve">, modification of designs, </w:t>
+                      </w:r>
+                      <w:proofErr w:type="spellStart"/>
+                      <w:r>
+                        <w:rPr>
+                          <w:rFonts w:ascii="Arial Narrow" w:eastAsia="Times New Roman" w:hAnsi="Arial Narrow" w:cs="Times New Roman"/>
+                          <w:sz w:val="24"/>
+                          <w:szCs w:val="24"/>
+                          <w:lang w:val="fr-FR" w:eastAsia="fr-FR"/>
+                        </w:rPr>
+                        <w:t>standardization</w:t>
+                      </w:r>
+                      <w:proofErr w:type="spellEnd"/>
+                      <w:r>
+                        <w:rPr>
+                          <w:rFonts w:ascii="Arial Narrow" w:eastAsia="Times New Roman" w:hAnsi="Arial Narrow" w:cs="Times New Roman"/>
+                          <w:sz w:val="24"/>
+                          <w:szCs w:val="24"/>
+                          <w:lang w:val="fr-FR" w:eastAsia="fr-FR"/>
+                        </w:rPr>
+                        <w:t xml:space="preserve"> of </w:t>
+                      </w:r>
+                      <w:proofErr w:type="spellStart"/>
+                      <w:r>
+                        <w:rPr>
+                          <w:rFonts w:ascii="Arial Narrow" w:eastAsia="Times New Roman" w:hAnsi="Arial Narrow" w:cs="Times New Roman"/>
+                          <w:sz w:val="24"/>
+                          <w:szCs w:val="24"/>
+                          <w:lang w:val="fr-FR" w:eastAsia="fr-FR"/>
+                        </w:rPr>
+                        <w:t>quality</w:t>
+                      </w:r>
+                      <w:proofErr w:type="spellEnd"/>
+                      <w:r>
+                        <w:rPr>
+                          <w:rFonts w:ascii="Arial Narrow" w:eastAsia="Times New Roman" w:hAnsi="Arial Narrow" w:cs="Times New Roman"/>
+                          <w:sz w:val="24"/>
+                          <w:szCs w:val="24"/>
+                          <w:lang w:val="fr-FR" w:eastAsia="fr-FR"/>
+                        </w:rPr>
+                        <w:t xml:space="preserve"> control. I </w:t>
+                      </w:r>
+                      <w:proofErr w:type="spellStart"/>
+                      <w:r>
+                        <w:rPr>
+                          <w:rFonts w:ascii="Arial Narrow" w:eastAsia="Times New Roman" w:hAnsi="Arial Narrow" w:cs="Times New Roman"/>
+                          <w:sz w:val="24"/>
+                          <w:szCs w:val="24"/>
+                          <w:lang w:val="fr-FR" w:eastAsia="fr-FR"/>
+                        </w:rPr>
+                        <w:t>developed</w:t>
+                      </w:r>
+                      <w:proofErr w:type="spellEnd"/>
+                      <w:r>
+                        <w:rPr>
+                          <w:rFonts w:ascii="Arial Narrow" w:eastAsia="Times New Roman" w:hAnsi="Arial Narrow" w:cs="Times New Roman"/>
+                          <w:sz w:val="24"/>
+                          <w:szCs w:val="24"/>
+                          <w:lang w:val="fr-FR" w:eastAsia="fr-FR"/>
+                        </w:rPr>
+                        <w:t xml:space="preserve"> and in charge of </w:t>
+                      </w:r>
+                      <w:proofErr w:type="spellStart"/>
+                      <w:r>
+                        <w:rPr>
+                          <w:rFonts w:ascii="Arial Narrow" w:eastAsia="Times New Roman" w:hAnsi="Arial Narrow" w:cs="Times New Roman"/>
+                          <w:sz w:val="24"/>
+                          <w:szCs w:val="24"/>
+                          <w:lang w:val="fr-FR" w:eastAsia="fr-FR"/>
+                        </w:rPr>
+                        <w:t>procedures</w:t>
+                      </w:r>
+                      <w:proofErr w:type="spellEnd"/>
+                      <w:r>
+                        <w:rPr>
+                          <w:rFonts w:ascii="Arial Narrow" w:eastAsia="Times New Roman" w:hAnsi="Arial Narrow" w:cs="Times New Roman"/>
+                          <w:sz w:val="24"/>
+                          <w:szCs w:val="24"/>
+                          <w:lang w:val="fr-FR" w:eastAsia="fr-FR"/>
+                        </w:rPr>
+                        <w:t xml:space="preserve">, Certification and Payment. I </w:t>
+                      </w:r>
+                      <w:proofErr w:type="spellStart"/>
+                      <w:r>
+                        <w:rPr>
+                          <w:rFonts w:ascii="Arial Narrow" w:eastAsia="Times New Roman" w:hAnsi="Arial Narrow" w:cs="Times New Roman"/>
+                          <w:sz w:val="24"/>
+                          <w:szCs w:val="24"/>
+                          <w:lang w:val="fr-FR" w:eastAsia="fr-FR"/>
+                        </w:rPr>
+                        <w:t>was</w:t>
+                      </w:r>
+                      <w:proofErr w:type="spellEnd"/>
+                      <w:r>
+                        <w:rPr>
+                          <w:rFonts w:ascii="Arial Narrow" w:eastAsia="Times New Roman" w:hAnsi="Arial Narrow" w:cs="Times New Roman"/>
+                          <w:sz w:val="24"/>
+                          <w:szCs w:val="24"/>
+                          <w:lang w:val="fr-FR" w:eastAsia="fr-FR"/>
+                        </w:rPr>
+                        <w:t xml:space="preserve"> monitoring and </w:t>
+                      </w:r>
+                      <w:proofErr w:type="spellStart"/>
+                      <w:r>
+                        <w:rPr>
+                          <w:rFonts w:ascii="Arial Narrow" w:eastAsia="Times New Roman" w:hAnsi="Arial Narrow" w:cs="Times New Roman"/>
+                          <w:sz w:val="24"/>
+                          <w:szCs w:val="24"/>
+                          <w:lang w:val="fr-FR" w:eastAsia="fr-FR"/>
+                        </w:rPr>
+                        <w:t>supervising</w:t>
+                      </w:r>
+                      <w:proofErr w:type="spellEnd"/>
+                      <w:r>
+                        <w:rPr>
+                          <w:rFonts w:ascii="Arial Narrow" w:eastAsia="Times New Roman" w:hAnsi="Arial Narrow" w:cs="Times New Roman"/>
+                          <w:sz w:val="24"/>
+                          <w:szCs w:val="24"/>
+                          <w:lang w:val="fr-FR" w:eastAsia="fr-FR"/>
+                        </w:rPr>
+                        <w:t xml:space="preserve"> </w:t>
+                      </w:r>
+                      <w:proofErr w:type="spellStart"/>
+                      <w:r>
+                        <w:rPr>
+                          <w:rFonts w:ascii="Arial Narrow" w:eastAsia="Times New Roman" w:hAnsi="Arial Narrow" w:cs="Times New Roman"/>
+                          <w:sz w:val="24"/>
+                          <w:szCs w:val="24"/>
+                          <w:lang w:val="fr-FR" w:eastAsia="fr-FR"/>
+                        </w:rPr>
+                        <w:t>contractor’s</w:t>
+                      </w:r>
+                      <w:proofErr w:type="spellEnd"/>
+                      <w:r>
+                        <w:rPr>
+                          <w:rFonts w:ascii="Arial Narrow" w:eastAsia="Times New Roman" w:hAnsi="Arial Narrow" w:cs="Times New Roman"/>
+                          <w:sz w:val="24"/>
+                          <w:szCs w:val="24"/>
+                          <w:lang w:val="fr-FR" w:eastAsia="fr-FR"/>
+                        </w:rPr>
+                        <w:t xml:space="preserve"> site </w:t>
+                      </w:r>
+                      <w:proofErr w:type="spellStart"/>
+                      <w:r>
+                        <w:rPr>
+                          <w:rFonts w:ascii="Arial Narrow" w:eastAsia="Times New Roman" w:hAnsi="Arial Narrow" w:cs="Times New Roman"/>
+                          <w:sz w:val="24"/>
+                          <w:szCs w:val="24"/>
+                          <w:lang w:val="fr-FR" w:eastAsia="fr-FR"/>
+                        </w:rPr>
+                        <w:t>works</w:t>
+                      </w:r>
+                      <w:proofErr w:type="spellEnd"/>
+                      <w:r>
+                        <w:rPr>
+                          <w:rFonts w:ascii="Arial Narrow" w:eastAsia="Times New Roman" w:hAnsi="Arial Narrow" w:cs="Times New Roman"/>
+                          <w:sz w:val="24"/>
+                          <w:szCs w:val="24"/>
+                          <w:lang w:val="fr-FR" w:eastAsia="fr-FR"/>
+                        </w:rPr>
+                        <w:t xml:space="preserve">. </w:t>
+                      </w:r>
+                      <w:proofErr w:type="spellStart"/>
+                      <w:r>
+                        <w:rPr>
+                          <w:rFonts w:ascii="Arial Narrow" w:eastAsia="Times New Roman" w:hAnsi="Arial Narrow" w:cs="Times New Roman"/>
+                          <w:sz w:val="24"/>
+                          <w:szCs w:val="24"/>
+                          <w:lang w:val="fr-FR" w:eastAsia="fr-FR"/>
+                        </w:rPr>
+                        <w:t>Coordinating</w:t>
+                      </w:r>
+                      <w:proofErr w:type="spellEnd"/>
+                      <w:r>
+                        <w:rPr>
+                          <w:rFonts w:ascii="Arial Narrow" w:eastAsia="Times New Roman" w:hAnsi="Arial Narrow" w:cs="Times New Roman"/>
+                          <w:sz w:val="24"/>
+                          <w:szCs w:val="24"/>
+                          <w:lang w:val="fr-FR" w:eastAsia="fr-FR"/>
+                        </w:rPr>
+                        <w:t xml:space="preserve"> </w:t>
+                      </w:r>
+                      <w:proofErr w:type="spellStart"/>
+                      <w:r>
+                        <w:rPr>
+                          <w:rFonts w:ascii="Arial Narrow" w:eastAsia="Times New Roman" w:hAnsi="Arial Narrow" w:cs="Times New Roman"/>
+                          <w:sz w:val="24"/>
+                          <w:szCs w:val="24"/>
+                          <w:lang w:val="fr-FR" w:eastAsia="fr-FR"/>
+                        </w:rPr>
+                        <w:t>with</w:t>
+                      </w:r>
+                      <w:proofErr w:type="spellEnd"/>
+                      <w:r>
+                        <w:rPr>
+                          <w:rFonts w:ascii="Arial Narrow" w:eastAsia="Times New Roman" w:hAnsi="Arial Narrow" w:cs="Times New Roman"/>
+                          <w:sz w:val="24"/>
+                          <w:szCs w:val="24"/>
+                          <w:lang w:val="fr-FR" w:eastAsia="fr-FR"/>
+                        </w:rPr>
+                        <w:t xml:space="preserve"> the team Leader in the </w:t>
+                      </w:r>
+                      <w:proofErr w:type="spellStart"/>
+                      <w:r>
+                        <w:rPr>
+                          <w:rFonts w:ascii="Arial Narrow" w:eastAsia="Times New Roman" w:hAnsi="Arial Narrow" w:cs="Times New Roman"/>
+                          <w:sz w:val="24"/>
+                          <w:szCs w:val="24"/>
+                          <w:lang w:val="fr-FR" w:eastAsia="fr-FR"/>
+                        </w:rPr>
+                        <w:t>discharge</w:t>
+                      </w:r>
+                      <w:proofErr w:type="spellEnd"/>
+                      <w:r>
+                        <w:rPr>
+                          <w:rFonts w:ascii="Arial Narrow" w:eastAsia="Times New Roman" w:hAnsi="Arial Narrow" w:cs="Times New Roman"/>
+                          <w:sz w:val="24"/>
+                          <w:szCs w:val="24"/>
+                          <w:lang w:val="fr-FR" w:eastAsia="fr-FR"/>
+                        </w:rPr>
+                        <w:t xml:space="preserve"> of </w:t>
+                      </w:r>
+                      <w:proofErr w:type="spellStart"/>
+                      <w:r>
+                        <w:rPr>
+                          <w:rFonts w:ascii="Arial Narrow" w:eastAsia="Times New Roman" w:hAnsi="Arial Narrow" w:cs="Times New Roman"/>
+                          <w:sz w:val="24"/>
+                          <w:szCs w:val="24"/>
+                          <w:lang w:val="fr-FR" w:eastAsia="fr-FR"/>
+                        </w:rPr>
+                        <w:t>his</w:t>
+                      </w:r>
+                      <w:proofErr w:type="spellEnd"/>
+                      <w:r>
+                        <w:rPr>
+                          <w:rFonts w:ascii="Arial Narrow" w:eastAsia="Times New Roman" w:hAnsi="Arial Narrow" w:cs="Times New Roman"/>
+                          <w:sz w:val="24"/>
+                          <w:szCs w:val="24"/>
+                          <w:lang w:val="fr-FR" w:eastAsia="fr-FR"/>
+                        </w:rPr>
+                        <w:t xml:space="preserve"> </w:t>
+                      </w:r>
+                      <w:proofErr w:type="spellStart"/>
+                      <w:r>
+                        <w:rPr>
+                          <w:rFonts w:ascii="Arial Narrow" w:eastAsia="Times New Roman" w:hAnsi="Arial Narrow" w:cs="Times New Roman"/>
+                          <w:sz w:val="24"/>
+                          <w:szCs w:val="24"/>
+                          <w:lang w:val="fr-FR" w:eastAsia="fr-FR"/>
+                        </w:rPr>
+                        <w:t>duties</w:t>
+                      </w:r>
+                      <w:proofErr w:type="spellEnd"/>
+                      <w:r>
+                        <w:rPr>
+                          <w:rFonts w:ascii="Arial Narrow" w:eastAsia="Times New Roman" w:hAnsi="Arial Narrow" w:cs="Times New Roman"/>
+                          <w:sz w:val="24"/>
+                          <w:szCs w:val="24"/>
+                          <w:lang w:val="fr-FR" w:eastAsia="fr-FR"/>
+                        </w:rPr>
+                        <w:t xml:space="preserve">. </w:t>
+                      </w:r>
+                      <w:proofErr w:type="spellStart"/>
+                      <w:r>
+                        <w:rPr>
+                          <w:rFonts w:ascii="Arial Narrow" w:eastAsia="Times New Roman" w:hAnsi="Arial Narrow" w:cs="Times New Roman"/>
+                          <w:sz w:val="24"/>
+                          <w:szCs w:val="24"/>
+                          <w:lang w:val="fr-FR" w:eastAsia="fr-FR"/>
+                        </w:rPr>
+                        <w:t>Supervising</w:t>
+                      </w:r>
+                      <w:proofErr w:type="spellEnd"/>
+                      <w:r>
+                        <w:rPr>
+                          <w:rFonts w:ascii="Arial Narrow" w:eastAsia="Times New Roman" w:hAnsi="Arial Narrow" w:cs="Times New Roman"/>
+                          <w:sz w:val="24"/>
+                          <w:szCs w:val="24"/>
+                          <w:lang w:val="fr-FR" w:eastAsia="fr-FR"/>
+                        </w:rPr>
+                        <w:t xml:space="preserve"> </w:t>
+                      </w:r>
+                      <w:proofErr w:type="spellStart"/>
+                      <w:r>
+                        <w:rPr>
+                          <w:rFonts w:ascii="Arial Narrow" w:eastAsia="Times New Roman" w:hAnsi="Arial Narrow" w:cs="Times New Roman"/>
+                          <w:sz w:val="24"/>
+                          <w:szCs w:val="24"/>
+                          <w:lang w:val="fr-FR" w:eastAsia="fr-FR"/>
+                        </w:rPr>
+                        <w:t>engineers</w:t>
+                      </w:r>
+                      <w:proofErr w:type="spellEnd"/>
+                      <w:r>
+                        <w:rPr>
+                          <w:rFonts w:ascii="Arial Narrow" w:eastAsia="Times New Roman" w:hAnsi="Arial Narrow" w:cs="Times New Roman"/>
+                          <w:sz w:val="24"/>
+                          <w:szCs w:val="24"/>
+                          <w:lang w:val="fr-FR" w:eastAsia="fr-FR"/>
+                        </w:rPr>
+                        <w:t xml:space="preserve"> &amp; </w:t>
+                      </w:r>
+                      <w:proofErr w:type="spellStart"/>
+                      <w:r>
+                        <w:rPr>
+                          <w:rFonts w:ascii="Arial Narrow" w:eastAsia="Times New Roman" w:hAnsi="Arial Narrow" w:cs="Times New Roman"/>
+                          <w:sz w:val="24"/>
+                          <w:szCs w:val="24"/>
+                          <w:lang w:val="fr-FR" w:eastAsia="fr-FR"/>
+                        </w:rPr>
+                        <w:t>Technicians</w:t>
+                      </w:r>
+                      <w:proofErr w:type="spellEnd"/>
+                      <w:r>
+                        <w:rPr>
+                          <w:rFonts w:ascii="Arial Narrow" w:eastAsia="Times New Roman" w:hAnsi="Arial Narrow" w:cs="Times New Roman"/>
+                          <w:sz w:val="24"/>
+                          <w:szCs w:val="24"/>
+                          <w:lang w:val="fr-FR" w:eastAsia="fr-FR"/>
+                        </w:rPr>
+                        <w:t xml:space="preserve">. </w:t>
+                      </w:r>
+                      <w:proofErr w:type="spellStart"/>
+                      <w:r>
+                        <w:rPr>
+                          <w:rFonts w:ascii="Arial Narrow" w:eastAsia="Times New Roman" w:hAnsi="Arial Narrow" w:cs="Times New Roman"/>
+                          <w:sz w:val="24"/>
+                          <w:szCs w:val="24"/>
+                          <w:lang w:val="fr-FR" w:eastAsia="fr-FR"/>
+                        </w:rPr>
+                        <w:t>Involved</w:t>
+                      </w:r>
+                      <w:proofErr w:type="spellEnd"/>
+                      <w:r>
+                        <w:rPr>
+                          <w:rFonts w:ascii="Arial Narrow" w:eastAsia="Times New Roman" w:hAnsi="Arial Narrow" w:cs="Times New Roman"/>
+                          <w:sz w:val="24"/>
+                          <w:szCs w:val="24"/>
+                          <w:lang w:val="fr-FR" w:eastAsia="fr-FR"/>
+                        </w:rPr>
+                        <w:t xml:space="preserve"> in the Designs, </w:t>
+                      </w:r>
+                      <w:proofErr w:type="spellStart"/>
+                      <w:r>
+                        <w:rPr>
+                          <w:rFonts w:ascii="Arial Narrow" w:eastAsia="Times New Roman" w:hAnsi="Arial Narrow" w:cs="Times New Roman"/>
+                          <w:sz w:val="24"/>
+                          <w:szCs w:val="24"/>
+                          <w:lang w:val="fr-FR" w:eastAsia="fr-FR"/>
+                        </w:rPr>
+                        <w:t>Contract</w:t>
+                      </w:r>
+                      <w:proofErr w:type="spellEnd"/>
+                      <w:r>
+                        <w:rPr>
+                          <w:rFonts w:ascii="Arial Narrow" w:eastAsia="Times New Roman" w:hAnsi="Arial Narrow" w:cs="Times New Roman"/>
+                          <w:sz w:val="24"/>
+                          <w:szCs w:val="24"/>
+                          <w:lang w:val="fr-FR" w:eastAsia="fr-FR"/>
+                        </w:rPr>
+                        <w:t xml:space="preserve"> documentation, Evaluation and </w:t>
+                      </w:r>
+                      <w:proofErr w:type="spellStart"/>
+                      <w:r>
+                        <w:rPr>
+                          <w:rFonts w:ascii="Arial Narrow" w:eastAsia="Times New Roman" w:hAnsi="Arial Narrow" w:cs="Times New Roman"/>
+                          <w:sz w:val="24"/>
+                          <w:szCs w:val="24"/>
+                          <w:lang w:val="fr-FR" w:eastAsia="fr-FR"/>
+                        </w:rPr>
+                        <w:t>awards</w:t>
+                      </w:r>
+                      <w:proofErr w:type="spellEnd"/>
+                      <w:r>
+                        <w:rPr>
+                          <w:rFonts w:ascii="Arial Narrow" w:eastAsia="Times New Roman" w:hAnsi="Arial Narrow" w:cs="Times New Roman"/>
+                          <w:sz w:val="24"/>
+                          <w:szCs w:val="24"/>
+                          <w:lang w:val="fr-FR" w:eastAsia="fr-FR"/>
+                        </w:rPr>
+                        <w:t xml:space="preserve">. </w:t>
+                      </w:r>
+                      <w:proofErr w:type="spellStart"/>
+                      <w:r>
+                        <w:rPr>
+                          <w:rFonts w:ascii="Arial Narrow" w:eastAsia="Times New Roman" w:hAnsi="Arial Narrow" w:cs="Times New Roman"/>
+                          <w:sz w:val="24"/>
+                          <w:szCs w:val="24"/>
+                          <w:lang w:val="fr-FR" w:eastAsia="fr-FR"/>
+                        </w:rPr>
+                        <w:t>Directly</w:t>
+                      </w:r>
+                      <w:proofErr w:type="spellEnd"/>
+                      <w:r>
+                        <w:rPr>
+                          <w:rFonts w:ascii="Arial Narrow" w:eastAsia="Times New Roman" w:hAnsi="Arial Narrow" w:cs="Times New Roman"/>
+                          <w:sz w:val="24"/>
+                          <w:szCs w:val="24"/>
+                          <w:lang w:val="fr-FR" w:eastAsia="fr-FR"/>
+                        </w:rPr>
+                        <w:t xml:space="preserve"> </w:t>
+                      </w:r>
+                      <w:proofErr w:type="spellStart"/>
+                      <w:r>
+                        <w:rPr>
+                          <w:rFonts w:ascii="Arial Narrow" w:eastAsia="Times New Roman" w:hAnsi="Arial Narrow" w:cs="Times New Roman"/>
+                          <w:sz w:val="24"/>
+                          <w:szCs w:val="24"/>
+                          <w:lang w:val="fr-FR" w:eastAsia="fr-FR"/>
+                        </w:rPr>
+                        <w:t>Involved</w:t>
+                      </w:r>
+                      <w:proofErr w:type="spellEnd"/>
+                      <w:r>
+                        <w:rPr>
+                          <w:rFonts w:ascii="Arial Narrow" w:eastAsia="Times New Roman" w:hAnsi="Arial Narrow" w:cs="Times New Roman"/>
+                          <w:sz w:val="24"/>
+                          <w:szCs w:val="24"/>
+                          <w:lang w:val="fr-FR" w:eastAsia="fr-FR"/>
+                        </w:rPr>
+                        <w:t xml:space="preserve"> in the Site Supervision for the </w:t>
+                      </w:r>
+                      <w:proofErr w:type="spellStart"/>
+                      <w:r>
+                        <w:rPr>
+                          <w:rFonts w:ascii="Arial Narrow" w:eastAsia="Times New Roman" w:hAnsi="Arial Narrow" w:cs="Times New Roman"/>
+                          <w:sz w:val="24"/>
+                          <w:szCs w:val="24"/>
+                          <w:lang w:val="fr-FR" w:eastAsia="fr-FR"/>
+                        </w:rPr>
+                        <w:t>asphalt</w:t>
+                      </w:r>
+                      <w:proofErr w:type="spellEnd"/>
+                      <w:r>
+                        <w:rPr>
+                          <w:rFonts w:ascii="Arial Narrow" w:eastAsia="Times New Roman" w:hAnsi="Arial Narrow" w:cs="Times New Roman"/>
+                          <w:sz w:val="24"/>
+                          <w:szCs w:val="24"/>
+                          <w:lang w:val="fr-FR" w:eastAsia="fr-FR"/>
+                        </w:rPr>
+                        <w:t xml:space="preserve"> Overlay. </w:t>
+                      </w:r>
+                      <w:proofErr w:type="spellStart"/>
+                      <w:r>
+                        <w:rPr>
+                          <w:rFonts w:ascii="Arial Narrow" w:eastAsia="Times New Roman" w:hAnsi="Arial Narrow" w:cs="Times New Roman"/>
+                          <w:sz w:val="24"/>
+                          <w:szCs w:val="24"/>
+                          <w:lang w:val="fr-FR" w:eastAsia="fr-FR"/>
+                        </w:rPr>
+                        <w:t>Reviewing</w:t>
+                      </w:r>
+                      <w:proofErr w:type="spellEnd"/>
+                      <w:r>
+                        <w:rPr>
+                          <w:rFonts w:ascii="Arial Narrow" w:eastAsia="Times New Roman" w:hAnsi="Arial Narrow" w:cs="Times New Roman"/>
+                          <w:sz w:val="24"/>
+                          <w:szCs w:val="24"/>
+                          <w:lang w:val="fr-FR" w:eastAsia="fr-FR"/>
+                        </w:rPr>
+                        <w:t xml:space="preserve"> the </w:t>
+                      </w:r>
+                      <w:proofErr w:type="spellStart"/>
+                      <w:r>
+                        <w:rPr>
+                          <w:rFonts w:ascii="Arial Narrow" w:eastAsia="Times New Roman" w:hAnsi="Arial Narrow" w:cs="Times New Roman"/>
+                          <w:sz w:val="24"/>
+                          <w:szCs w:val="24"/>
+                          <w:lang w:val="fr-FR" w:eastAsia="fr-FR"/>
+                        </w:rPr>
+                        <w:t>Contractor’s</w:t>
+                      </w:r>
+                      <w:proofErr w:type="spellEnd"/>
+                      <w:r>
+                        <w:rPr>
+                          <w:rFonts w:ascii="Arial Narrow" w:eastAsia="Times New Roman" w:hAnsi="Arial Narrow" w:cs="Times New Roman"/>
+                          <w:sz w:val="24"/>
+                          <w:szCs w:val="24"/>
+                          <w:lang w:val="fr-FR" w:eastAsia="fr-FR"/>
+                        </w:rPr>
+                        <w:t xml:space="preserve"> </w:t>
+                      </w:r>
+                      <w:proofErr w:type="spellStart"/>
+                      <w:r>
+                        <w:rPr>
+                          <w:rFonts w:ascii="Arial Narrow" w:eastAsia="Times New Roman" w:hAnsi="Arial Narrow" w:cs="Times New Roman"/>
+                          <w:sz w:val="24"/>
+                          <w:szCs w:val="24"/>
+                          <w:lang w:val="fr-FR" w:eastAsia="fr-FR"/>
+                        </w:rPr>
+                        <w:t>operations</w:t>
+                      </w:r>
+                      <w:proofErr w:type="spellEnd"/>
+                      <w:r>
+                        <w:rPr>
+                          <w:rFonts w:ascii="Arial Narrow" w:eastAsia="Times New Roman" w:hAnsi="Arial Narrow" w:cs="Times New Roman"/>
+                          <w:sz w:val="24"/>
+                          <w:szCs w:val="24"/>
+                          <w:lang w:val="fr-FR" w:eastAsia="fr-FR"/>
+                        </w:rPr>
+                        <w:t xml:space="preserve"> and construction planning.  </w:t>
+                      </w:r>
+                      <w:proofErr w:type="spellStart"/>
+                      <w:r>
+                        <w:rPr>
+                          <w:rFonts w:ascii="Arial Narrow" w:eastAsia="Times New Roman" w:hAnsi="Arial Narrow" w:cs="Times New Roman"/>
+                          <w:sz w:val="24"/>
+                          <w:szCs w:val="24"/>
+                          <w:lang w:val="fr-FR" w:eastAsia="fr-FR"/>
+                        </w:rPr>
+                        <w:t>Preparing</w:t>
+                      </w:r>
+                      <w:proofErr w:type="spellEnd"/>
+                      <w:r>
+                        <w:rPr>
+                          <w:rFonts w:ascii="Arial Narrow" w:eastAsia="Times New Roman" w:hAnsi="Arial Narrow" w:cs="Times New Roman"/>
+                          <w:sz w:val="24"/>
+                          <w:szCs w:val="24"/>
+                          <w:lang w:val="fr-FR" w:eastAsia="fr-FR"/>
+                        </w:rPr>
+                        <w:t xml:space="preserve"> and </w:t>
+                      </w:r>
+                      <w:proofErr w:type="spellStart"/>
+                      <w:r>
+                        <w:rPr>
+                          <w:rFonts w:ascii="Arial Narrow" w:eastAsia="Times New Roman" w:hAnsi="Arial Narrow" w:cs="Times New Roman"/>
+                          <w:sz w:val="24"/>
+                          <w:szCs w:val="24"/>
+                          <w:lang w:val="fr-FR" w:eastAsia="fr-FR"/>
+                        </w:rPr>
+                        <w:t>approving</w:t>
+                      </w:r>
+                      <w:proofErr w:type="spellEnd"/>
+                      <w:r>
+                        <w:rPr>
+                          <w:rFonts w:ascii="Arial Narrow" w:eastAsia="Times New Roman" w:hAnsi="Arial Narrow" w:cs="Times New Roman"/>
+                          <w:sz w:val="24"/>
+                          <w:szCs w:val="24"/>
+                          <w:lang w:val="fr-FR" w:eastAsia="fr-FR"/>
+                        </w:rPr>
+                        <w:t xml:space="preserve"> </w:t>
+                      </w:r>
+                      <w:proofErr w:type="spellStart"/>
+                      <w:r>
+                        <w:rPr>
+                          <w:rFonts w:ascii="Arial Narrow" w:eastAsia="Times New Roman" w:hAnsi="Arial Narrow" w:cs="Times New Roman"/>
+                          <w:sz w:val="24"/>
+                          <w:szCs w:val="24"/>
+                          <w:lang w:val="fr-FR" w:eastAsia="fr-FR"/>
+                        </w:rPr>
+                        <w:t>IPCs</w:t>
+                      </w:r>
+                      <w:proofErr w:type="spellEnd"/>
+                      <w:r>
+                        <w:rPr>
+                          <w:rFonts w:ascii="Arial Narrow" w:eastAsia="Times New Roman" w:hAnsi="Arial Narrow" w:cs="Times New Roman"/>
+                          <w:sz w:val="24"/>
+                          <w:szCs w:val="24"/>
+                          <w:lang w:val="fr-FR" w:eastAsia="fr-FR"/>
+                        </w:rPr>
+                        <w:t xml:space="preserve"> </w:t>
+                      </w:r>
+                      <w:proofErr w:type="spellStart"/>
+                      <w:r>
+                        <w:rPr>
+                          <w:rFonts w:ascii="Arial Narrow" w:eastAsia="Times New Roman" w:hAnsi="Arial Narrow" w:cs="Times New Roman"/>
+                          <w:sz w:val="24"/>
+                          <w:szCs w:val="24"/>
+                          <w:lang w:val="fr-FR" w:eastAsia="fr-FR"/>
+                        </w:rPr>
+                        <w:t>inconjunction</w:t>
+                      </w:r>
+                      <w:proofErr w:type="spellEnd"/>
+                      <w:r>
+                        <w:rPr>
+                          <w:rFonts w:ascii="Arial Narrow" w:eastAsia="Times New Roman" w:hAnsi="Arial Narrow" w:cs="Times New Roman"/>
+                          <w:sz w:val="24"/>
+                          <w:szCs w:val="24"/>
+                          <w:lang w:val="fr-FR" w:eastAsia="fr-FR"/>
+                        </w:rPr>
+                        <w:t xml:space="preserve"> </w:t>
+                      </w:r>
+                      <w:proofErr w:type="spellStart"/>
+                      <w:r>
+                        <w:rPr>
+                          <w:rFonts w:ascii="Arial Narrow" w:eastAsia="Times New Roman" w:hAnsi="Arial Narrow" w:cs="Times New Roman"/>
+                          <w:sz w:val="24"/>
+                          <w:szCs w:val="24"/>
+                          <w:lang w:val="fr-FR" w:eastAsia="fr-FR"/>
+                        </w:rPr>
+                        <w:t>with</w:t>
+                      </w:r>
+                      <w:proofErr w:type="spellEnd"/>
+                      <w:r>
+                        <w:rPr>
+                          <w:rFonts w:ascii="Arial Narrow" w:eastAsia="Times New Roman" w:hAnsi="Arial Narrow" w:cs="Times New Roman"/>
+                          <w:sz w:val="24"/>
+                          <w:szCs w:val="24"/>
+                          <w:lang w:val="fr-FR" w:eastAsia="fr-FR"/>
+                        </w:rPr>
+                        <w:t xml:space="preserve"> the </w:t>
+                      </w:r>
+                      <w:proofErr w:type="spellStart"/>
+                      <w:r>
+                        <w:rPr>
+                          <w:rFonts w:ascii="Arial Narrow" w:eastAsia="Times New Roman" w:hAnsi="Arial Narrow" w:cs="Times New Roman"/>
+                          <w:sz w:val="24"/>
+                          <w:szCs w:val="24"/>
+                          <w:lang w:val="fr-FR" w:eastAsia="fr-FR"/>
+                        </w:rPr>
+                        <w:t>Quantity</w:t>
+                      </w:r>
+                      <w:proofErr w:type="spellEnd"/>
+                      <w:r>
+                        <w:rPr>
+                          <w:rFonts w:ascii="Arial Narrow" w:eastAsia="Times New Roman" w:hAnsi="Arial Narrow" w:cs="Times New Roman"/>
+                          <w:sz w:val="24"/>
+                          <w:szCs w:val="24"/>
+                          <w:lang w:val="fr-FR" w:eastAsia="fr-FR"/>
+                        </w:rPr>
+                        <w:t xml:space="preserve"> </w:t>
+                      </w:r>
+                      <w:proofErr w:type="spellStart"/>
+                      <w:r>
+                        <w:rPr>
+                          <w:rFonts w:ascii="Arial Narrow" w:eastAsia="Times New Roman" w:hAnsi="Arial Narrow" w:cs="Times New Roman"/>
+                          <w:sz w:val="24"/>
+                          <w:szCs w:val="24"/>
+                          <w:lang w:val="fr-FR" w:eastAsia="fr-FR"/>
+                        </w:rPr>
+                        <w:t>Surveyor</w:t>
+                      </w:r>
+                      <w:proofErr w:type="spellEnd"/>
+                      <w:r>
+                        <w:rPr>
+                          <w:rFonts w:ascii="Arial Narrow" w:eastAsia="Times New Roman" w:hAnsi="Arial Narrow" w:cs="Times New Roman"/>
+                          <w:sz w:val="24"/>
+                          <w:szCs w:val="24"/>
+                          <w:lang w:val="fr-FR" w:eastAsia="fr-FR"/>
+                        </w:rPr>
+                        <w:t xml:space="preserve">. </w:t>
+                      </w:r>
+                      <w:proofErr w:type="spellStart"/>
+                      <w:r>
+                        <w:rPr>
+                          <w:rFonts w:ascii="Arial Narrow" w:eastAsia="Times New Roman" w:hAnsi="Arial Narrow" w:cs="Times New Roman"/>
+                          <w:sz w:val="24"/>
+                          <w:szCs w:val="24"/>
+                          <w:lang w:val="fr-FR" w:eastAsia="fr-FR"/>
+                        </w:rPr>
+                        <w:t>Chairing</w:t>
+                      </w:r>
+                      <w:proofErr w:type="spellEnd"/>
+                      <w:r>
+                        <w:rPr>
+                          <w:rFonts w:ascii="Arial Narrow" w:eastAsia="Times New Roman" w:hAnsi="Arial Narrow" w:cs="Times New Roman"/>
+                          <w:sz w:val="24"/>
+                          <w:szCs w:val="24"/>
+                          <w:lang w:val="fr-FR" w:eastAsia="fr-FR"/>
+                        </w:rPr>
+                        <w:t xml:space="preserve"> Meetings and </w:t>
+                      </w:r>
+                      <w:proofErr w:type="spellStart"/>
+                      <w:r>
+                        <w:rPr>
+                          <w:rFonts w:ascii="Arial Narrow" w:eastAsia="Times New Roman" w:hAnsi="Arial Narrow" w:cs="Times New Roman"/>
+                          <w:sz w:val="24"/>
+                          <w:szCs w:val="24"/>
+                          <w:lang w:val="fr-FR" w:eastAsia="fr-FR"/>
+                        </w:rPr>
+                        <w:t>organising</w:t>
+                      </w:r>
+                      <w:proofErr w:type="spellEnd"/>
+                      <w:r>
+                        <w:rPr>
+                          <w:rFonts w:ascii="Arial Narrow" w:eastAsia="Times New Roman" w:hAnsi="Arial Narrow" w:cs="Times New Roman"/>
+                          <w:sz w:val="24"/>
+                          <w:szCs w:val="24"/>
+                          <w:lang w:val="fr-FR" w:eastAsia="fr-FR"/>
+                        </w:rPr>
+                        <w:t xml:space="preserve"> </w:t>
+                      </w:r>
+                      <w:proofErr w:type="spellStart"/>
+                      <w:r>
+                        <w:rPr>
+                          <w:rFonts w:ascii="Arial Narrow" w:eastAsia="Times New Roman" w:hAnsi="Arial Narrow" w:cs="Times New Roman"/>
+                          <w:sz w:val="24"/>
+                          <w:szCs w:val="24"/>
+                          <w:lang w:val="fr-FR" w:eastAsia="fr-FR"/>
+                        </w:rPr>
+                        <w:t>monthly</w:t>
+                      </w:r>
+                      <w:proofErr w:type="spellEnd"/>
+                      <w:r>
+                        <w:rPr>
+                          <w:rFonts w:ascii="Arial Narrow" w:eastAsia="Times New Roman" w:hAnsi="Arial Narrow" w:cs="Times New Roman"/>
+                          <w:sz w:val="24"/>
+                          <w:szCs w:val="24"/>
+                          <w:lang w:val="fr-FR" w:eastAsia="fr-FR"/>
+                        </w:rPr>
+                        <w:t xml:space="preserve"> management meetings </w:t>
+                      </w:r>
+                      <w:proofErr w:type="spellStart"/>
+                      <w:r>
+                        <w:rPr>
+                          <w:rFonts w:ascii="Arial Narrow" w:eastAsia="Times New Roman" w:hAnsi="Arial Narrow" w:cs="Times New Roman"/>
+                          <w:sz w:val="24"/>
+                          <w:szCs w:val="24"/>
+                          <w:lang w:val="fr-FR" w:eastAsia="fr-FR"/>
+                        </w:rPr>
+                        <w:t>with</w:t>
+                      </w:r>
+                      <w:proofErr w:type="spellEnd"/>
+                      <w:r>
+                        <w:rPr>
+                          <w:rFonts w:ascii="Arial Narrow" w:eastAsia="Times New Roman" w:hAnsi="Arial Narrow" w:cs="Times New Roman"/>
+                          <w:sz w:val="24"/>
+                          <w:szCs w:val="24"/>
+                          <w:lang w:val="fr-FR" w:eastAsia="fr-FR"/>
+                        </w:rPr>
+                        <w:t xml:space="preserve"> stakeholders. </w:t>
+                      </w:r>
+                      <w:proofErr w:type="spellStart"/>
+                      <w:r>
+                        <w:rPr>
+                          <w:rFonts w:ascii="Arial Narrow" w:eastAsia="Times New Roman" w:hAnsi="Arial Narrow" w:cs="Times New Roman"/>
+                          <w:sz w:val="24"/>
+                          <w:szCs w:val="24"/>
+                          <w:lang w:val="fr-FR" w:eastAsia="fr-FR"/>
+                        </w:rPr>
+                        <w:t>Undertaking</w:t>
+                      </w:r>
+                      <w:proofErr w:type="spellEnd"/>
+                      <w:r>
+                        <w:rPr>
+                          <w:rFonts w:ascii="Arial Narrow" w:eastAsia="Times New Roman" w:hAnsi="Arial Narrow" w:cs="Times New Roman"/>
+                          <w:sz w:val="24"/>
+                          <w:szCs w:val="24"/>
+                          <w:lang w:val="fr-FR" w:eastAsia="fr-FR"/>
+                        </w:rPr>
+                        <w:t xml:space="preserve"> Site Monitoring and Supervision and </w:t>
+                      </w:r>
+                      <w:proofErr w:type="spellStart"/>
+                      <w:r>
+                        <w:rPr>
+                          <w:rFonts w:ascii="Arial Narrow" w:eastAsia="Times New Roman" w:hAnsi="Arial Narrow" w:cs="Times New Roman"/>
+                          <w:sz w:val="24"/>
+                          <w:szCs w:val="24"/>
+                          <w:lang w:val="fr-FR" w:eastAsia="fr-FR"/>
+                        </w:rPr>
+                        <w:t>issuing</w:t>
+                      </w:r>
+                      <w:proofErr w:type="spellEnd"/>
+                      <w:r>
+                        <w:rPr>
+                          <w:rFonts w:ascii="Arial Narrow" w:eastAsia="Times New Roman" w:hAnsi="Arial Narrow" w:cs="Times New Roman"/>
+                          <w:sz w:val="24"/>
+                          <w:szCs w:val="24"/>
+                          <w:lang w:val="fr-FR" w:eastAsia="fr-FR"/>
+                        </w:rPr>
+                        <w:t xml:space="preserve"> design changes and site instructions. </w:t>
+                      </w:r>
+                      <w:proofErr w:type="spellStart"/>
+                      <w:r>
+                        <w:rPr>
+                          <w:rFonts w:ascii="Arial Narrow" w:eastAsia="Times New Roman" w:hAnsi="Arial Narrow" w:cs="Times New Roman"/>
+                          <w:sz w:val="24"/>
+                          <w:szCs w:val="24"/>
+                          <w:lang w:val="fr-FR" w:eastAsia="fr-FR"/>
+                        </w:rPr>
+                        <w:t>Preparation</w:t>
+                      </w:r>
+                      <w:proofErr w:type="spellEnd"/>
+                      <w:r>
+                        <w:rPr>
+                          <w:rFonts w:ascii="Arial Narrow" w:eastAsia="Times New Roman" w:hAnsi="Arial Narrow" w:cs="Times New Roman"/>
+                          <w:sz w:val="24"/>
+                          <w:szCs w:val="24"/>
+                          <w:lang w:val="fr-FR" w:eastAsia="fr-FR"/>
+                        </w:rPr>
+                        <w:t xml:space="preserve"> and </w:t>
+                      </w:r>
+                      <w:proofErr w:type="spellStart"/>
+                      <w:r>
+                        <w:rPr>
+                          <w:rFonts w:ascii="Arial Narrow" w:eastAsia="Times New Roman" w:hAnsi="Arial Narrow" w:cs="Times New Roman"/>
+                          <w:sz w:val="24"/>
+                          <w:szCs w:val="24"/>
+                          <w:lang w:val="fr-FR" w:eastAsia="fr-FR"/>
+                        </w:rPr>
+                        <w:t>submission</w:t>
+                      </w:r>
+                      <w:proofErr w:type="spellEnd"/>
+                      <w:r>
+                        <w:rPr>
+                          <w:rFonts w:ascii="Arial Narrow" w:eastAsia="Times New Roman" w:hAnsi="Arial Narrow" w:cs="Times New Roman"/>
+                          <w:sz w:val="24"/>
+                          <w:szCs w:val="24"/>
+                          <w:lang w:val="fr-FR" w:eastAsia="fr-FR"/>
+                        </w:rPr>
+                        <w:t xml:space="preserve"> of </w:t>
+                      </w:r>
+                      <w:proofErr w:type="spellStart"/>
+                      <w:r>
+                        <w:rPr>
+                          <w:rFonts w:ascii="Arial Narrow" w:eastAsia="Times New Roman" w:hAnsi="Arial Narrow" w:cs="Times New Roman"/>
+                          <w:sz w:val="24"/>
+                          <w:szCs w:val="24"/>
+                          <w:lang w:val="fr-FR" w:eastAsia="fr-FR"/>
+                        </w:rPr>
+                        <w:t>monthly</w:t>
+                      </w:r>
+                      <w:proofErr w:type="spellEnd"/>
+                      <w:r>
+                        <w:rPr>
+                          <w:rFonts w:ascii="Arial Narrow" w:eastAsia="Times New Roman" w:hAnsi="Arial Narrow" w:cs="Times New Roman"/>
+                          <w:sz w:val="24"/>
+                          <w:szCs w:val="24"/>
+                          <w:lang w:val="fr-FR" w:eastAsia="fr-FR"/>
+                        </w:rPr>
+                        <w:t xml:space="preserve"> </w:t>
+                      </w:r>
+                      <w:proofErr w:type="spellStart"/>
+                      <w:r>
+                        <w:rPr>
+                          <w:rFonts w:ascii="Arial Narrow" w:eastAsia="Times New Roman" w:hAnsi="Arial Narrow" w:cs="Times New Roman"/>
+                          <w:sz w:val="24"/>
+                          <w:szCs w:val="24"/>
+                          <w:lang w:val="fr-FR" w:eastAsia="fr-FR"/>
+                        </w:rPr>
+                        <w:t>progress</w:t>
+                      </w:r>
+                      <w:proofErr w:type="spellEnd"/>
                       <w:r>
                         <w:rPr>
                           <w:rFonts w:ascii="Arial Narrow" w:eastAsia="Times New Roman" w:hAnsi="Arial Narrow"/>
@@ -7549,7 +8835,33 @@
                           <w:szCs w:val="24"/>
                           <w:lang w:val="en-GB" w:eastAsia="fr-FR"/>
                         </w:rPr>
-                        <w:t xml:space="preserve">Liberia Swedish Feeder Roads Project Phase III (LSFRP-3) 700km in Bong, Lofa, Grangedeh, River Gee, Grand Kru and Maryland Counties. Liberia (2017-2020) </w:t>
+                        <w:t xml:space="preserve">Liberia Swedish Feeder Roads Project Phase III (LSFRP-3) 700km in Bong, Lofa, </w:t>
+                      </w:r>
+                      <w:proofErr w:type="spellStart"/>
+                      <w:r>
+                        <w:rPr>
+                          <w:rFonts w:ascii="Arial Narrow" w:eastAsia="Times New Roman" w:hAnsi="Arial Narrow"/>
+                          <w:b/>
+                          <w:bCs/>
+                          <w:snapToGrid w:val="0"/>
+                          <w:sz w:val="24"/>
+                          <w:szCs w:val="24"/>
+                          <w:lang w:val="en-GB" w:eastAsia="fr-FR"/>
+                        </w:rPr>
+                        <w:t>Grangedeh</w:t>
+                      </w:r>
+                      <w:proofErr w:type="spellEnd"/>
+                      <w:r>
+                        <w:rPr>
+                          <w:rFonts w:ascii="Arial Narrow" w:eastAsia="Times New Roman" w:hAnsi="Arial Narrow"/>
+                          <w:b/>
+                          <w:bCs/>
+                          <w:snapToGrid w:val="0"/>
+                          <w:sz w:val="24"/>
+                          <w:szCs w:val="24"/>
+                          <w:lang w:val="en-GB" w:eastAsia="fr-FR"/>
+                        </w:rPr>
+                        <w:t xml:space="preserve">, River Gee, Grand Kru and Maryland Counties. Liberia (2017-2020) </w:t>
                       </w:r>
                     </w:p>
                     <w:p>
@@ -7624,7 +8936,7 @@
                           <w:szCs w:val="24"/>
                           <w:lang w:val="en-GB" w:eastAsia="fr-FR"/>
                         </w:rPr>
-                        <w:t xml:space="preserve">Assisting the Senior Road Implementation Engineer/Team Leader in the review of cost estimates, modification of designs, standardization of quality control procedures, Certification and Payment Responsible for monitoring and supervising contractor’s site works. Designs and contract administration of the project execution. Coordinating with a team of engineers and reporting to the Team </w:t>
+                        <w:t>Assisting the Senior Road Implementation Engineer/Team Leader in the review of cost estimates, modification of designs, standardization of quality control procedures, Certification and Payment Responsible for monitoring and supervising contractor’s site works. Designs and contract administration of the project execution. Coordinating with a team of engineers and reporting to the Team leader</w:t>
                       </w:r>
                       <w:r>
                         <w:rPr>
@@ -7634,7 +8946,7 @@
                           <w:szCs w:val="24"/>
                           <w:lang w:val="en-GB" w:eastAsia="fr-FR"/>
                         </w:rPr>
-                        <w:t>leader</w:t>
+                        <w:t>.</w:t>
                       </w:r>
                       <w:r>
                         <w:rPr>
@@ -7644,27 +8956,7 @@
                           <w:szCs w:val="24"/>
                           <w:lang w:val="en-GB" w:eastAsia="fr-FR"/>
                         </w:rPr>
-                        <w:t>.</w:t>
-                      </w:r>
-                      <w:r>
-                        <w:rPr>
-                          <w:rFonts w:ascii="Arial Narrow" w:eastAsia="Times New Roman" w:hAnsi="Arial Narrow"/>
-                          <w:snapToGrid w:val="0"/>
-                          <w:sz w:val="24"/>
-                          <w:szCs w:val="24"/>
-                          <w:lang w:val="en-GB" w:eastAsia="fr-FR"/>
-                        </w:rPr>
-                        <w:t xml:space="preserve"> Designs</w:t>
-                      </w:r>
-                      <w:r>
-                        <w:rPr>
-                          <w:rFonts w:ascii="Arial Narrow" w:eastAsia="Times New Roman" w:hAnsi="Arial Narrow"/>
-                          <w:snapToGrid w:val="0"/>
-                          <w:sz w:val="24"/>
-                          <w:szCs w:val="24"/>
-                          <w:lang w:val="en-GB" w:eastAsia="fr-FR"/>
-                        </w:rPr>
-                        <w:t>, Contract documentation, Evaluation and awards. Monitoring all Contractual issues and Advises Team Leader/Senior Road Implementation Engineer on Claim Mitigation and Assessments</w:t>
+                        <w:t xml:space="preserve"> Designs, Contract documentation, Evaluation and awards. Monitoring all Contractual issues and Advises Team Leader/Senior Road Implementation Engineer on Claim Mitigation and Assessments</w:t>
                       </w:r>
                       <w:r>
                         <w:rPr>
@@ -7763,6 +9055,1044 @@
           <w:vertAlign w:val="subscript"/>
         </w:rPr>
       </w:pPr>
+      <w:r>
+        <w:rPr>
+          <w:noProof/>
+          <w:vertAlign w:val="subscript"/>
+        </w:rPr>
+        <mc:AlternateContent>
+          <mc:Choice Requires="wps">
+            <w:drawing>
+              <wp:anchor distT="45720" distB="45720" distL="114300" distR="114300" simplePos="0" relativeHeight="251727872" behindDoc="0" locked="1" layoutInCell="1" allowOverlap="1" wp14:anchorId="056E32DA" wp14:editId="2A1F4A59">
+                <wp:simplePos x="0" y="0"/>
+                <wp:positionH relativeFrom="page">
+                  <wp:posOffset>160020</wp:posOffset>
+                </wp:positionH>
+                <wp:positionV relativeFrom="page">
+                  <wp:posOffset>327660</wp:posOffset>
+                </wp:positionV>
+                <wp:extent cx="1844040" cy="8595360"/>
+                <wp:effectExtent l="0" t="0" r="0" b="0"/>
+                <wp:wrapSquare wrapText="bothSides"/>
+                <wp:docPr id="1735119004" name="Text Box 1735119004"/>
+                <wp:cNvGraphicFramePr>
+                  <a:graphicFrameLocks xmlns:a="http://schemas.openxmlformats.org/drawingml/2006/main"/>
+                </wp:cNvGraphicFramePr>
+                <a:graphic xmlns:a="http://schemas.openxmlformats.org/drawingml/2006/main">
+                  <a:graphicData uri="http://schemas.microsoft.com/office/word/2010/wordprocessingShape">
+                    <wps:wsp>
+                      <wps:cNvSpPr txBox="1">
+                        <a:spLocks noChangeArrowheads="1"/>
+                      </wps:cNvSpPr>
+                      <wps:spPr bwMode="auto">
+                        <a:xfrm>
+                          <a:off x="0" y="0"/>
+                          <a:ext cx="1844040" cy="8595360"/>
+                        </a:xfrm>
+                        <a:prstGeom prst="rect">
+                          <a:avLst/>
+                        </a:prstGeom>
+                        <a:noFill/>
+                        <a:ln w="9525">
+                          <a:noFill/>
+                          <a:miter lim="800000"/>
+                          <a:headEnd/>
+                          <a:tailEnd/>
+                        </a:ln>
+                      </wps:spPr>
+                      <wps:txbx>
+                        <w:txbxContent>
+                          <w:p>
+                            <w:pPr>
+                              <w:pStyle w:val="Heading1"/>
+                            </w:pPr>
+                            <w:r>
+                              <w:t>KEY SKILLS</w:t>
+                            </w:r>
+                          </w:p>
+                          <w:p>
+                            <w:pPr>
+                              <w:pStyle w:val="List"/>
+                              <w:ind w:left="360"/>
+                              <w:jc w:val="left"/>
+                              <w:rPr>
+                                <w:szCs w:val="22"/>
+                              </w:rPr>
+                            </w:pPr>
+                            <w:r>
+                              <w:rPr>
+                                <w:szCs w:val="22"/>
+                              </w:rPr>
+                              <w:t>Highway Design</w:t>
+                            </w:r>
+                          </w:p>
+                          <w:p>
+                            <w:pPr>
+                              <w:pStyle w:val="List"/>
+                              <w:ind w:left="360"/>
+                              <w:jc w:val="left"/>
+                              <w:rPr>
+                                <w:szCs w:val="22"/>
+                                <w:lang w:val="fr-FR"/>
+                              </w:rPr>
+                            </w:pPr>
+                            <w:r>
+                              <w:rPr>
+                                <w:szCs w:val="22"/>
+                              </w:rPr>
+                              <w:t xml:space="preserve">Traffic Data Analyisys </w:t>
+                            </w:r>
+                          </w:p>
+                          <w:p>
+                            <w:pPr>
+                              <w:pStyle w:val="List"/>
+                              <w:ind w:left="360"/>
+                              <w:jc w:val="left"/>
+                            </w:pPr>
+                            <w:r>
+                              <w:t>Project Management</w:t>
+                            </w:r>
+                          </w:p>
+                          <w:p>
+                            <w:pPr>
+                              <w:pStyle w:val="List"/>
+                              <w:ind w:left="360"/>
+                              <w:jc w:val="left"/>
+                            </w:pPr>
+                            <w:r>
+                              <w:t>Project Cost estimation</w:t>
+                            </w:r>
+                          </w:p>
+                          <w:p>
+                            <w:pPr>
+                              <w:pStyle w:val="List"/>
+                              <w:ind w:left="360"/>
+                              <w:jc w:val="left"/>
+                            </w:pPr>
+                            <w:r>
+                              <w:rPr>
+                                <w:lang w:val="en-GB"/>
+                              </w:rPr>
+                              <w:t>Project control</w:t>
+                            </w:r>
+                          </w:p>
+                          <w:p>
+                            <w:pPr>
+                              <w:pStyle w:val="List"/>
+                              <w:ind w:left="360"/>
+                              <w:jc w:val="left"/>
+                            </w:pPr>
+                            <w:r>
+                              <w:rPr>
+                                <w:lang w:val="en-GB"/>
+                              </w:rPr>
+                              <w:t>Urban Transport Design</w:t>
+                            </w:r>
+                          </w:p>
+                          <w:p>
+                            <w:pPr>
+                              <w:pStyle w:val="List"/>
+                              <w:ind w:left="360"/>
+                              <w:jc w:val="left"/>
+                            </w:pPr>
+                            <w:r>
+                              <w:rPr>
+                                <w:lang w:val="en-GB"/>
+                              </w:rPr>
+                              <w:t>Highway Supervision</w:t>
+                            </w:r>
+                          </w:p>
+                          <w:p>
+                            <w:pPr>
+                              <w:pStyle w:val="List"/>
+                              <w:ind w:left="360"/>
+                              <w:jc w:val="left"/>
+                            </w:pPr>
+                            <w:r>
+                              <w:rPr>
+                                <w:lang w:val="en-GB"/>
+                              </w:rPr>
+                              <w:t>Contract Management</w:t>
+                            </w:r>
+                          </w:p>
+                          <w:p>
+                            <w:pPr>
+                              <w:pStyle w:val="List"/>
+                              <w:ind w:left="360"/>
+                              <w:jc w:val="left"/>
+                            </w:pPr>
+                            <w:r>
+                              <w:t>Materials/Quality Control</w:t>
+                            </w:r>
+                          </w:p>
+                          <w:p>
+                            <w:pPr>
+                              <w:pStyle w:val="List"/>
+                              <w:numPr>
+                                <w:ilvl w:val="0"/>
+                                <w:numId w:val="0"/>
+                              </w:numPr>
+                              <w:ind w:left="720" w:hanging="360"/>
+                              <w:jc w:val="left"/>
+                            </w:pPr>
+                          </w:p>
+                          <w:p>
+                            <w:pPr>
+                              <w:pStyle w:val="List"/>
+                              <w:numPr>
+                                <w:ilvl w:val="0"/>
+                                <w:numId w:val="0"/>
+                              </w:numPr>
+                              <w:ind w:left="720" w:hanging="360"/>
+                              <w:jc w:val="left"/>
+                            </w:pPr>
+                          </w:p>
+                          <w:p>
+                            <w:pPr>
+                              <w:pStyle w:val="Heading1"/>
+                            </w:pPr>
+                            <w:r>
+                              <w:t>Key Positions Held</w:t>
+                            </w:r>
+                          </w:p>
+                          <w:p>
+                            <w:pPr>
+                              <w:pStyle w:val="List"/>
+                              <w:jc w:val="left"/>
+                            </w:pPr>
+                            <w:r>
+                              <w:rPr>
+                                <w:snapToGrid w:val="0"/>
+                                <w:lang w:val="fr-FR" w:eastAsia="fr-FR"/>
+                              </w:rPr>
+                              <w:t>Project Manager</w:t>
+                            </w:r>
+                          </w:p>
+                          <w:p>
+                            <w:pPr>
+                              <w:pStyle w:val="List"/>
+                              <w:jc w:val="left"/>
+                            </w:pPr>
+                            <w:r>
+                              <w:rPr>
+                                <w:snapToGrid w:val="0"/>
+                                <w:lang w:val="fr-FR" w:eastAsia="fr-FR"/>
+                              </w:rPr>
+                              <w:t>Assist. Project Manager</w:t>
+                            </w:r>
+                          </w:p>
+                          <w:p>
+                            <w:pPr>
+                              <w:pStyle w:val="List"/>
+                              <w:jc w:val="left"/>
+                            </w:pPr>
+                            <w:r>
+                              <w:rPr>
+                                <w:snapToGrid w:val="0"/>
+                                <w:lang w:val="fr-FR" w:eastAsia="fr-FR"/>
+                              </w:rPr>
+                              <w:t xml:space="preserve">Project Control </w:t>
+                            </w:r>
+                            <w:proofErr w:type="spellStart"/>
+                            <w:r>
+                              <w:rPr>
+                                <w:snapToGrid w:val="0"/>
+                                <w:lang w:val="fr-FR" w:eastAsia="fr-FR"/>
+                              </w:rPr>
+                              <w:t>Enginee</w:t>
+                            </w:r>
+                            <w:r>
+                              <w:rPr>
+                                <w:snapToGrid w:val="0"/>
+                                <w:lang w:val="fr-FR" w:eastAsia="fr-FR"/>
+                              </w:rPr>
+                              <w:t>r</w:t>
+                            </w:r>
+                            <w:proofErr w:type="spellEnd"/>
+                            <w:r>
+                              <w:rPr>
+                                <w:snapToGrid w:val="0"/>
+                                <w:lang w:val="fr-FR" w:eastAsia="fr-FR"/>
+                              </w:rPr>
+                              <w:t>.</w:t>
+                            </w:r>
+                          </w:p>
+                          <w:p>
+                            <w:pPr>
+                              <w:pStyle w:val="List"/>
+                              <w:jc w:val="left"/>
+                            </w:pPr>
+                            <w:r>
+                              <w:rPr>
+                                <w:snapToGrid w:val="0"/>
+                                <w:lang w:val="fr-FR" w:eastAsia="fr-FR"/>
+                              </w:rPr>
+                              <w:t xml:space="preserve">Senior Regional Field </w:t>
+                            </w:r>
+                            <w:proofErr w:type="spellStart"/>
+                            <w:r>
+                              <w:rPr>
+                                <w:snapToGrid w:val="0"/>
+                                <w:lang w:val="fr-FR" w:eastAsia="fr-FR"/>
+                              </w:rPr>
+                              <w:t>Engineer</w:t>
+                            </w:r>
+                            <w:proofErr w:type="spellEnd"/>
+                          </w:p>
+                          <w:p>
+                            <w:pPr>
+                              <w:pStyle w:val="List"/>
+                              <w:jc w:val="left"/>
+                            </w:pPr>
+                            <w:r>
+                              <w:rPr>
+                                <w:snapToGrid w:val="0"/>
+                                <w:lang w:val="fr-FR" w:eastAsia="fr-FR"/>
+                              </w:rPr>
+                              <w:t xml:space="preserve">Resident </w:t>
+                            </w:r>
+                            <w:proofErr w:type="spellStart"/>
+                            <w:r>
+                              <w:rPr>
+                                <w:snapToGrid w:val="0"/>
+                                <w:lang w:val="fr-FR" w:eastAsia="fr-FR"/>
+                              </w:rPr>
+                              <w:t>Engineer</w:t>
+                            </w:r>
+                            <w:proofErr w:type="spellEnd"/>
+                          </w:p>
+                          <w:p>
+                            <w:pPr>
+                              <w:pStyle w:val="List"/>
+                              <w:jc w:val="left"/>
+                            </w:pPr>
+                            <w:r>
+                              <w:rPr>
+                                <w:snapToGrid w:val="0"/>
+                                <w:lang w:val="fr-FR" w:eastAsia="fr-FR"/>
+                              </w:rPr>
+                              <w:t xml:space="preserve">Highway </w:t>
+                            </w:r>
+                            <w:proofErr w:type="spellStart"/>
+                            <w:r>
+                              <w:rPr>
+                                <w:snapToGrid w:val="0"/>
+                                <w:lang w:val="fr-FR" w:eastAsia="fr-FR"/>
+                              </w:rPr>
+                              <w:t>Engineer</w:t>
+                            </w:r>
+                            <w:proofErr w:type="spellEnd"/>
+                          </w:p>
+                          <w:p>
+                            <w:pPr>
+                              <w:pStyle w:val="List"/>
+                              <w:jc w:val="left"/>
+                            </w:pPr>
+                            <w:proofErr w:type="spellStart"/>
+                            <w:r>
+                              <w:rPr>
+                                <w:snapToGrid w:val="0"/>
+                                <w:lang w:val="fr-FR" w:eastAsia="fr-FR"/>
+                              </w:rPr>
+                              <w:t>Contract</w:t>
+                            </w:r>
+                            <w:proofErr w:type="spellEnd"/>
+                            <w:r>
+                              <w:rPr>
+                                <w:snapToGrid w:val="0"/>
+                                <w:lang w:val="fr-FR" w:eastAsia="fr-FR"/>
+                              </w:rPr>
+                              <w:t xml:space="preserve"> </w:t>
+                            </w:r>
+                            <w:proofErr w:type="spellStart"/>
+                            <w:r>
+                              <w:rPr>
+                                <w:snapToGrid w:val="0"/>
+                                <w:lang w:val="fr-FR" w:eastAsia="fr-FR"/>
+                              </w:rPr>
+                              <w:t>Engineer</w:t>
+                            </w:r>
+                            <w:proofErr w:type="spellEnd"/>
+                          </w:p>
+                          <w:p>
+                            <w:pPr>
+                              <w:pStyle w:val="List"/>
+                              <w:jc w:val="left"/>
+                            </w:pPr>
+                            <w:r>
+                              <w:rPr>
+                                <w:snapToGrid w:val="0"/>
+                                <w:lang w:val="fr-FR" w:eastAsia="fr-FR"/>
+                              </w:rPr>
+                              <w:t>Quarry Manager</w:t>
+                            </w:r>
+                          </w:p>
+                          <w:p>
+                            <w:pPr>
+                              <w:pStyle w:val="List"/>
+                              <w:jc w:val="left"/>
+                            </w:pPr>
+                            <w:r>
+                              <w:rPr>
+                                <w:snapToGrid w:val="0"/>
+                                <w:lang w:val="fr-FR" w:eastAsia="fr-FR"/>
+                              </w:rPr>
+                              <w:t>Assistant</w:t>
+                            </w:r>
+                            <w:r>
+                              <w:rPr>
+                                <w:snapToGrid w:val="0"/>
+                                <w:lang w:val="fr-FR" w:eastAsia="fr-FR"/>
+                              </w:rPr>
+                              <w:t xml:space="preserve"> </w:t>
+                            </w:r>
+                            <w:proofErr w:type="spellStart"/>
+                            <w:r>
+                              <w:rPr>
+                                <w:snapToGrid w:val="0"/>
+                                <w:lang w:val="fr-FR" w:eastAsia="fr-FR"/>
+                              </w:rPr>
+                              <w:t>Laboratory</w:t>
+                            </w:r>
+                            <w:proofErr w:type="spellEnd"/>
+                            <w:r>
+                              <w:rPr>
+                                <w:snapToGrid w:val="0"/>
+                                <w:lang w:val="fr-FR" w:eastAsia="fr-FR"/>
+                              </w:rPr>
+                              <w:t xml:space="preserve"> Manager</w:t>
+                            </w:r>
+                          </w:p>
+                          <w:p>
+                            <w:pPr>
+                              <w:pStyle w:val="List"/>
+                              <w:jc w:val="left"/>
+                            </w:pPr>
+                            <w:r>
+                              <w:rPr>
+                                <w:snapToGrid w:val="0"/>
+                                <w:lang w:val="fr-FR" w:eastAsia="fr-FR"/>
+                              </w:rPr>
+                              <w:t xml:space="preserve">Road construction </w:t>
+                            </w:r>
+                            <w:proofErr w:type="spellStart"/>
+                            <w:r>
+                              <w:rPr>
+                                <w:snapToGrid w:val="0"/>
+                                <w:lang w:val="fr-FR" w:eastAsia="fr-FR"/>
+                              </w:rPr>
+                              <w:t>Engineer</w:t>
+                            </w:r>
+                            <w:proofErr w:type="spellEnd"/>
+                          </w:p>
+                          <w:p>
+                            <w:pPr>
+                              <w:pStyle w:val="List"/>
+                              <w:jc w:val="left"/>
+                            </w:pPr>
+                            <w:r>
+                              <w:rPr>
+                                <w:snapToGrid w:val="0"/>
+                                <w:lang w:val="fr-FR" w:eastAsia="fr-FR"/>
+                              </w:rPr>
+                              <w:t xml:space="preserve">Office Planning </w:t>
+                            </w:r>
+                            <w:proofErr w:type="spellStart"/>
+                            <w:r>
+                              <w:rPr>
+                                <w:snapToGrid w:val="0"/>
+                                <w:lang w:val="fr-FR" w:eastAsia="fr-FR"/>
+                              </w:rPr>
+                              <w:t>Engineer</w:t>
+                            </w:r>
+                            <w:proofErr w:type="spellEnd"/>
+                          </w:p>
+                          <w:p>
+                            <w:pPr>
+                              <w:pStyle w:val="List"/>
+                              <w:jc w:val="left"/>
+                            </w:pPr>
+                            <w:r>
+                              <w:rPr>
+                                <w:snapToGrid w:val="0"/>
+                                <w:lang w:val="fr-FR" w:eastAsia="fr-FR"/>
+                              </w:rPr>
+                              <w:t xml:space="preserve">Roads &amp; Civil Works </w:t>
+                            </w:r>
+                            <w:proofErr w:type="spellStart"/>
+                            <w:r>
+                              <w:rPr>
+                                <w:snapToGrid w:val="0"/>
+                                <w:lang w:val="fr-FR" w:eastAsia="fr-FR"/>
+                              </w:rPr>
+                              <w:t>Supervisor</w:t>
+                            </w:r>
+                            <w:proofErr w:type="spellEnd"/>
+                          </w:p>
+                          <w:p>
+                            <w:pPr>
+                              <w:pStyle w:val="List"/>
+                              <w:jc w:val="left"/>
+                            </w:pPr>
+                            <w:r>
+                              <w:rPr>
+                                <w:snapToGrid w:val="0"/>
+                                <w:lang w:val="fr-FR" w:eastAsia="fr-FR"/>
+                              </w:rPr>
+                              <w:t xml:space="preserve">Building </w:t>
+                            </w:r>
+                            <w:proofErr w:type="spellStart"/>
+                            <w:r>
+                              <w:rPr>
+                                <w:snapToGrid w:val="0"/>
+                                <w:lang w:val="fr-FR" w:eastAsia="fr-FR"/>
+                              </w:rPr>
+                              <w:t>Const</w:t>
+                            </w:r>
+                            <w:proofErr w:type="spellEnd"/>
+                            <w:r>
+                              <w:rPr>
+                                <w:snapToGrid w:val="0"/>
+                                <w:lang w:val="fr-FR" w:eastAsia="fr-FR"/>
+                              </w:rPr>
+                              <w:t xml:space="preserve">. </w:t>
+                            </w:r>
+                          </w:p>
+                          <w:p>
+                            <w:pPr>
+                              <w:pStyle w:val="List"/>
+                              <w:jc w:val="left"/>
+                            </w:pPr>
+                            <w:proofErr w:type="spellStart"/>
+                            <w:r>
+                              <w:rPr>
+                                <w:snapToGrid w:val="0"/>
+                                <w:lang w:val="fr-FR" w:eastAsia="fr-FR"/>
+                              </w:rPr>
+                              <w:t>Supervisor</w:t>
+                            </w:r>
+                            <w:proofErr w:type="spellEnd"/>
+                            <w:r>
+                              <w:rPr>
+                                <w:snapToGrid w:val="0"/>
+                                <w:lang w:val="fr-FR" w:eastAsia="fr-FR"/>
+                              </w:rPr>
+                              <w:t xml:space="preserve"> &amp; Consultant</w:t>
+                            </w:r>
+                          </w:p>
+                        </w:txbxContent>
+                      </wps:txbx>
+                      <wps:bodyPr rot="0" vert="horz" wrap="square" lIns="91440" tIns="45720" rIns="91440" bIns="45720" anchor="t" anchorCtr="0">
+                        <a:noAutofit/>
+                      </wps:bodyPr>
+                    </wps:wsp>
+                  </a:graphicData>
+                </a:graphic>
+                <wp14:sizeRelH relativeFrom="margin">
+                  <wp14:pctWidth>0</wp14:pctWidth>
+                </wp14:sizeRelH>
+                <wp14:sizeRelV relativeFrom="margin">
+                  <wp14:pctHeight>0</wp14:pctHeight>
+                </wp14:sizeRelV>
+              </wp:anchor>
+            </w:drawing>
+          </mc:Choice>
+          <mc:Fallback>
+            <w:pict>
+              <v:shapetype w14:anchorId="056E32DA" id="_x0000_t202" coordsize="21600,21600" o:spt="202" path="m,l,21600r21600,l21600,xe">
+                <v:stroke joinstyle="miter"/>
+                <v:path gradientshapeok="t" o:connecttype="rect"/>
+              </v:shapetype>
+              <v:shape id="Text Box 1735119004" o:spid="_x0000_s1035" type="#_x0000_t202" style="position:absolute;margin-left:12.6pt;margin-top:25.8pt;width:145.2pt;height:676.8pt;z-index:251727872;visibility:visible;mso-wrap-style:square;mso-width-percent:0;mso-height-percent:0;mso-wrap-distance-left:9pt;mso-wrap-distance-top:3.6pt;mso-wrap-distance-right:9pt;mso-wrap-distance-bottom:3.6pt;mso-position-horizontal:absolute;mso-position-horizontal-relative:page;mso-position-vertical:absolute;mso-position-vertical-relative:page;mso-width-percent:0;mso-height-percent:0;mso-width-relative:margin;mso-height-relative:margin;v-text-anchor:top" o:gfxdata="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" filled="f" stroked="f">
+                <v:textbox>
+                  <w:txbxContent>
+                    <w:p>
+                      <w:pPr>
+                        <w:pStyle w:val="Heading1"/>
+                      </w:pPr>
+                      <w:r>
+                        <w:t>KEY SKILLS</w:t>
+                      </w:r>
+                    </w:p>
+                    <w:p>
+                      <w:pPr>
+                        <w:pStyle w:val="List"/>
+                        <w:ind w:left="360"/>
+                        <w:jc w:val="left"/>
+                        <w:rPr>
+                          <w:szCs w:val="22"/>
+                        </w:rPr>
+                      </w:pPr>
+                      <w:r>
+                        <w:rPr>
+                          <w:szCs w:val="22"/>
+                        </w:rPr>
+                        <w:t>Highway Design</w:t>
+                      </w:r>
+                    </w:p>
+                    <w:p>
+                      <w:pPr>
+                        <w:pStyle w:val="List"/>
+                        <w:ind w:left="360"/>
+                        <w:jc w:val="left"/>
+                        <w:rPr>
+                          <w:szCs w:val="22"/>
+                          <w:lang w:val="fr-FR"/>
+                        </w:rPr>
+                      </w:pPr>
+                      <w:r>
+                        <w:rPr>
+                          <w:szCs w:val="22"/>
+                        </w:rPr>
+                        <w:t xml:space="preserve">Traffic Data Analyisys </w:t>
+                      </w:r>
+                    </w:p>
+                    <w:p>
+                      <w:pPr>
+                        <w:pStyle w:val="List"/>
+                        <w:ind w:left="360"/>
+                        <w:jc w:val="left"/>
+                      </w:pPr>
+                      <w:r>
+                        <w:t>Project Management</w:t>
+                      </w:r>
+                    </w:p>
+                    <w:p>
+                      <w:pPr>
+                        <w:pStyle w:val="List"/>
+                        <w:ind w:left="360"/>
+                        <w:jc w:val="left"/>
+                      </w:pPr>
+                      <w:r>
+                        <w:t>Project Cost estimation</w:t>
+                      </w:r>
+                    </w:p>
+                    <w:p>
+                      <w:pPr>
+                        <w:pStyle w:val="List"/>
+                        <w:ind w:left="360"/>
+                        <w:jc w:val="left"/>
+                      </w:pPr>
+                      <w:r>
+                        <w:rPr>
+                          <w:lang w:val="en-GB"/>
+                        </w:rPr>
+                        <w:t>Project control</w:t>
+                      </w:r>
+                    </w:p>
+                    <w:p>
+                      <w:pPr>
+                        <w:pStyle w:val="List"/>
+                        <w:ind w:left="360"/>
+                        <w:jc w:val="left"/>
+                      </w:pPr>
+                      <w:r>
+                        <w:rPr>
+                          <w:lang w:val="en-GB"/>
+                        </w:rPr>
+                        <w:t>Urban Transport Design</w:t>
+                      </w:r>
+                    </w:p>
+                    <w:p>
+                      <w:pPr>
+                        <w:pStyle w:val="List"/>
+                        <w:ind w:left="360"/>
+                        <w:jc w:val="left"/>
+                      </w:pPr>
+                      <w:r>
+                        <w:rPr>
+                          <w:lang w:val="en-GB"/>
+                        </w:rPr>
+                        <w:t>Highway Supervision</w:t>
+                      </w:r>
+                    </w:p>
+                    <w:p>
+                      <w:pPr>
+                        <w:pStyle w:val="List"/>
+                        <w:ind w:left="360"/>
+                        <w:jc w:val="left"/>
+                      </w:pPr>
+                      <w:r>
+                        <w:rPr>
+                          <w:lang w:val="en-GB"/>
+                        </w:rPr>
+                        <w:t>Contract Management</w:t>
+                      </w:r>
+                    </w:p>
+                    <w:p>
+                      <w:pPr>
+                        <w:pStyle w:val="List"/>
+                        <w:ind w:left="360"/>
+                        <w:jc w:val="left"/>
+                      </w:pPr>
+                      <w:r>
+                        <w:t>Materials/Quality Control</w:t>
+                      </w:r>
+                    </w:p>
+                    <w:p>
+                      <w:pPr>
+                        <w:pStyle w:val="List"/>
+                        <w:numPr>
+                          <w:ilvl w:val="0"/>
+                          <w:numId w:val="0"/>
+                        </w:numPr>
+                        <w:ind w:left="720" w:hanging="360"/>
+                        <w:jc w:val="left"/>
+                      </w:pPr>
+                    </w:p>
+                    <w:p>
+                      <w:pPr>
+                        <w:pStyle w:val="List"/>
+                        <w:numPr>
+                          <w:ilvl w:val="0"/>
+                          <w:numId w:val="0"/>
+                        </w:numPr>
+                        <w:ind w:left="720" w:hanging="360"/>
+                        <w:jc w:val="left"/>
+                      </w:pPr>
+                    </w:p>
+                    <w:p>
+                      <w:pPr>
+                        <w:pStyle w:val="Heading1"/>
+                      </w:pPr>
+                      <w:r>
+                        <w:t>Key Positions Held</w:t>
+                      </w:r>
+                    </w:p>
+                    <w:p>
+                      <w:pPr>
+                        <w:pStyle w:val="List"/>
+                        <w:jc w:val="left"/>
+                      </w:pPr>
+                      <w:r>
+                        <w:rPr>
+                          <w:snapToGrid w:val="0"/>
+                          <w:lang w:val="fr-FR" w:eastAsia="fr-FR"/>
+                        </w:rPr>
+                        <w:t>Project Manager</w:t>
+                      </w:r>
+                    </w:p>
+                    <w:p>
+                      <w:pPr>
+                        <w:pStyle w:val="List"/>
+                        <w:jc w:val="left"/>
+                      </w:pPr>
+                      <w:r>
+                        <w:rPr>
+                          <w:snapToGrid w:val="0"/>
+                          <w:lang w:val="fr-FR" w:eastAsia="fr-FR"/>
+                        </w:rPr>
+                        <w:t>Assist. Project Manager</w:t>
+                      </w:r>
+                    </w:p>
+                    <w:p>
+                      <w:pPr>
+                        <w:pStyle w:val="List"/>
+                        <w:jc w:val="left"/>
+                      </w:pPr>
+                      <w:r>
+                        <w:rPr>
+                          <w:snapToGrid w:val="0"/>
+                          <w:lang w:val="fr-FR" w:eastAsia="fr-FR"/>
+                        </w:rPr>
+                        <w:t xml:space="preserve">Project Control </w:t>
+                      </w:r>
+                      <w:proofErr w:type="spellStart"/>
+                      <w:r>
+                        <w:rPr>
+                          <w:snapToGrid w:val="0"/>
+                          <w:lang w:val="fr-FR" w:eastAsia="fr-FR"/>
+                        </w:rPr>
+                        <w:t>Enginee</w:t>
+                      </w:r>
+                      <w:r>
+                        <w:rPr>
+                          <w:snapToGrid w:val="0"/>
+                          <w:lang w:val="fr-FR" w:eastAsia="fr-FR"/>
+                        </w:rPr>
+                        <w:t>r</w:t>
+                      </w:r>
+                      <w:proofErr w:type="spellEnd"/>
+                      <w:r>
+                        <w:rPr>
+                          <w:snapToGrid w:val="0"/>
+                          <w:lang w:val="fr-FR" w:eastAsia="fr-FR"/>
+                        </w:rPr>
+                        <w:t>.</w:t>
+                      </w:r>
+                    </w:p>
+                    <w:p>
+                      <w:pPr>
+                        <w:pStyle w:val="List"/>
+                        <w:jc w:val="left"/>
+                      </w:pPr>
+                      <w:r>
+                        <w:rPr>
+                          <w:snapToGrid w:val="0"/>
+                          <w:lang w:val="fr-FR" w:eastAsia="fr-FR"/>
+                        </w:rPr>
+                        <w:t xml:space="preserve">Senior Regional Field </w:t>
+                      </w:r>
+                      <w:proofErr w:type="spellStart"/>
+                      <w:r>
+                        <w:rPr>
+                          <w:snapToGrid w:val="0"/>
+                          <w:lang w:val="fr-FR" w:eastAsia="fr-FR"/>
+                        </w:rPr>
+                        <w:t>Engineer</w:t>
+                      </w:r>
+                      <w:proofErr w:type="spellEnd"/>
+                    </w:p>
+                    <w:p>
+                      <w:pPr>
+                        <w:pStyle w:val="List"/>
+                        <w:jc w:val="left"/>
+                      </w:pPr>
+                      <w:r>
+                        <w:rPr>
+                          <w:snapToGrid w:val="0"/>
+                          <w:lang w:val="fr-FR" w:eastAsia="fr-FR"/>
+                        </w:rPr>
+                        <w:t xml:space="preserve">Resident </w:t>
+                      </w:r>
+                      <w:proofErr w:type="spellStart"/>
+                      <w:r>
+                        <w:rPr>
+                          <w:snapToGrid w:val="0"/>
+                          <w:lang w:val="fr-FR" w:eastAsia="fr-FR"/>
+                        </w:rPr>
+                        <w:t>Engineer</w:t>
+                      </w:r>
+                      <w:proofErr w:type="spellEnd"/>
+                    </w:p>
+                    <w:p>
+                      <w:pPr>
+                        <w:pStyle w:val="List"/>
+                        <w:jc w:val="left"/>
+                      </w:pPr>
+                      <w:r>
+                        <w:rPr>
+                          <w:snapToGrid w:val="0"/>
+                          <w:lang w:val="fr-FR" w:eastAsia="fr-FR"/>
+                        </w:rPr>
+                        <w:t xml:space="preserve">Highway </w:t>
+                      </w:r>
+                      <w:proofErr w:type="spellStart"/>
+                      <w:r>
+                        <w:rPr>
+                          <w:snapToGrid w:val="0"/>
+                          <w:lang w:val="fr-FR" w:eastAsia="fr-FR"/>
+                        </w:rPr>
+                        <w:t>Engineer</w:t>
+                      </w:r>
+                      <w:proofErr w:type="spellEnd"/>
+                    </w:p>
+                    <w:p>
+                      <w:pPr>
+                        <w:pStyle w:val="List"/>
+                        <w:jc w:val="left"/>
+                      </w:pPr>
+                      <w:proofErr w:type="spellStart"/>
+                      <w:r>
+                        <w:rPr>
+                          <w:snapToGrid w:val="0"/>
+                          <w:lang w:val="fr-FR" w:eastAsia="fr-FR"/>
+                        </w:rPr>
+                        <w:t>Contract</w:t>
+                      </w:r>
+                      <w:proofErr w:type="spellEnd"/>
+                      <w:r>
+                        <w:rPr>
+                          <w:snapToGrid w:val="0"/>
+                          <w:lang w:val="fr-FR" w:eastAsia="fr-FR"/>
+                        </w:rPr>
+                        <w:t xml:space="preserve"> </w:t>
+                      </w:r>
+                      <w:proofErr w:type="spellStart"/>
+                      <w:r>
+                        <w:rPr>
+                          <w:snapToGrid w:val="0"/>
+                          <w:lang w:val="fr-FR" w:eastAsia="fr-FR"/>
+                        </w:rPr>
+                        <w:t>Engineer</w:t>
+                      </w:r>
+                      <w:proofErr w:type="spellEnd"/>
+                    </w:p>
+                    <w:p>
+                      <w:pPr>
+                        <w:pStyle w:val="List"/>
+                        <w:jc w:val="left"/>
+                      </w:pPr>
+                      <w:r>
+                        <w:rPr>
+                          <w:snapToGrid w:val="0"/>
+                          <w:lang w:val="fr-FR" w:eastAsia="fr-FR"/>
+                        </w:rPr>
+                        <w:t>Quarry Manager</w:t>
+                      </w:r>
+                    </w:p>
+                    <w:p>
+                      <w:pPr>
+                        <w:pStyle w:val="List"/>
+                        <w:jc w:val="left"/>
+                      </w:pPr>
+                      <w:r>
+                        <w:rPr>
+                          <w:snapToGrid w:val="0"/>
+                          <w:lang w:val="fr-FR" w:eastAsia="fr-FR"/>
+                        </w:rPr>
+                        <w:t>Assistant</w:t>
+                      </w:r>
+                      <w:r>
+                        <w:rPr>
+                          <w:snapToGrid w:val="0"/>
+                          <w:lang w:val="fr-FR" w:eastAsia="fr-FR"/>
+                        </w:rPr>
+                        <w:t xml:space="preserve"> </w:t>
+                      </w:r>
+                      <w:proofErr w:type="spellStart"/>
+                      <w:r>
+                        <w:rPr>
+                          <w:snapToGrid w:val="0"/>
+                          <w:lang w:val="fr-FR" w:eastAsia="fr-FR"/>
+                        </w:rPr>
+                        <w:t>Laboratory</w:t>
+                      </w:r>
+                      <w:proofErr w:type="spellEnd"/>
+                      <w:r>
+                        <w:rPr>
+                          <w:snapToGrid w:val="0"/>
+                          <w:lang w:val="fr-FR" w:eastAsia="fr-FR"/>
+                        </w:rPr>
+                        <w:t xml:space="preserve"> Manager</w:t>
+                      </w:r>
+                    </w:p>
+                    <w:p>
+                      <w:pPr>
+                        <w:pStyle w:val="List"/>
+                        <w:jc w:val="left"/>
+                      </w:pPr>
+                      <w:r>
+                        <w:rPr>
+                          <w:snapToGrid w:val="0"/>
+                          <w:lang w:val="fr-FR" w:eastAsia="fr-FR"/>
+                        </w:rPr>
+                        <w:t xml:space="preserve">Road construction </w:t>
+                      </w:r>
+                      <w:proofErr w:type="spellStart"/>
+                      <w:r>
+                        <w:rPr>
+                          <w:snapToGrid w:val="0"/>
+                          <w:lang w:val="fr-FR" w:eastAsia="fr-FR"/>
+                        </w:rPr>
+                        <w:t>Engineer</w:t>
+                      </w:r>
+                      <w:proofErr w:type="spellEnd"/>
+                    </w:p>
+                    <w:p>
+                      <w:pPr>
+                        <w:pStyle w:val="List"/>
+                        <w:jc w:val="left"/>
+                      </w:pPr>
+                      <w:r>
+                        <w:rPr>
+                          <w:snapToGrid w:val="0"/>
+                          <w:lang w:val="fr-FR" w:eastAsia="fr-FR"/>
+                        </w:rPr>
+                        <w:t xml:space="preserve">Office Planning </w:t>
+                      </w:r>
+                      <w:proofErr w:type="spellStart"/>
+                      <w:r>
+                        <w:rPr>
+                          <w:snapToGrid w:val="0"/>
+                          <w:lang w:val="fr-FR" w:eastAsia="fr-FR"/>
+                        </w:rPr>
+                        <w:t>Engineer</w:t>
+                      </w:r>
+                      <w:proofErr w:type="spellEnd"/>
+                    </w:p>
+                    <w:p>
+                      <w:pPr>
+                        <w:pStyle w:val="List"/>
+                        <w:jc w:val="left"/>
+                      </w:pPr>
+                      <w:r>
+                        <w:rPr>
+                          <w:snapToGrid w:val="0"/>
+                          <w:lang w:val="fr-FR" w:eastAsia="fr-FR"/>
+                        </w:rPr>
+                        <w:t xml:space="preserve">Roads &amp; Civil Works </w:t>
+                      </w:r>
+                      <w:proofErr w:type="spellStart"/>
+                      <w:r>
+                        <w:rPr>
+                          <w:snapToGrid w:val="0"/>
+                          <w:lang w:val="fr-FR" w:eastAsia="fr-FR"/>
+                        </w:rPr>
+                        <w:t>Supervisor</w:t>
+                      </w:r>
+                      <w:proofErr w:type="spellEnd"/>
+                    </w:p>
+                    <w:p>
+                      <w:pPr>
+                        <w:pStyle w:val="List"/>
+                        <w:jc w:val="left"/>
+                      </w:pPr>
+                      <w:r>
+                        <w:rPr>
+                          <w:snapToGrid w:val="0"/>
+                          <w:lang w:val="fr-FR" w:eastAsia="fr-FR"/>
+                        </w:rPr>
+                        <w:t xml:space="preserve">Building </w:t>
+                      </w:r>
+                      <w:proofErr w:type="spellStart"/>
+                      <w:r>
+                        <w:rPr>
+                          <w:snapToGrid w:val="0"/>
+                          <w:lang w:val="fr-FR" w:eastAsia="fr-FR"/>
+                        </w:rPr>
+                        <w:t>Const</w:t>
+                      </w:r>
+                      <w:proofErr w:type="spellEnd"/>
+                      <w:r>
+                        <w:rPr>
+                          <w:snapToGrid w:val="0"/>
+                          <w:lang w:val="fr-FR" w:eastAsia="fr-FR"/>
+                        </w:rPr>
+                        <w:t xml:space="preserve">. </w:t>
+                      </w:r>
+                    </w:p>
+                    <w:p>
+                      <w:pPr>
+                        <w:pStyle w:val="List"/>
+                        <w:jc w:val="left"/>
+                      </w:pPr>
+                      <w:proofErr w:type="spellStart"/>
+                      <w:r>
+                        <w:rPr>
+                          <w:snapToGrid w:val="0"/>
+                          <w:lang w:val="fr-FR" w:eastAsia="fr-FR"/>
+                        </w:rPr>
+                        <w:t>Supervisor</w:t>
+                      </w:r>
+                      <w:proofErr w:type="spellEnd"/>
+                      <w:r>
+                        <w:rPr>
+                          <w:snapToGrid w:val="0"/>
+                          <w:lang w:val="fr-FR" w:eastAsia="fr-FR"/>
+                        </w:rPr>
+                        <w:t xml:space="preserve"> &amp; Consultant</w:t>
+                      </w:r>
+                    </w:p>
+                  </w:txbxContent>
+                </v:textbox>
+                <w10:wrap type="square" anchorx="page" anchory="page"/>
+                <w10:anchorlock/>
+              </v:shape>
+            </w:pict>
+          </mc:Fallback>
+        </mc:AlternateContent>
+      </w:r>
     </w:p>
     <w:p>
       <w:pPr>
@@ -7816,16 +10146,16 @@
         <mc:AlternateContent>
           <mc:Choice Requires="wps">
             <w:drawing>
-              <wp:anchor distT="45720" distB="45720" distL="114300" distR="114300" simplePos="0" relativeHeight="251725824" behindDoc="0" locked="1" layoutInCell="1" allowOverlap="1" wp14:anchorId="11308E57" wp14:editId="7156FDFC">
+              <wp:anchor distT="45720" distB="45720" distL="114300" distR="114300" simplePos="0" relativeHeight="251725824" behindDoc="0" locked="1" layoutInCell="1" allowOverlap="1" wp14:anchorId="11308E57" wp14:editId="19F3DA60">
                 <wp:simplePos x="0" y="0"/>
                 <wp:positionH relativeFrom="margin">
                   <wp:posOffset>2026920</wp:posOffset>
                 </wp:positionH>
-                <wp:positionV relativeFrom="page">
-                  <wp:posOffset>129540</wp:posOffset>
+                <wp:positionV relativeFrom="margin">
+                  <wp:align>top</wp:align>
                 </wp:positionV>
-                <wp:extent cx="4730115" cy="9767570"/>
-                <wp:effectExtent l="0" t="0" r="0" b="5080"/>
+                <wp:extent cx="4730115" cy="9174480"/>
+                <wp:effectExtent l="0" t="0" r="0" b="0"/>
                 <wp:wrapSquare wrapText="bothSides"/>
                 <wp:docPr id="999919709" name="Text Box 999919709"/>
                 <wp:cNvGraphicFramePr>
@@ -7840,7 +10170,7 @@
                       <wps:spPr bwMode="auto">
                         <a:xfrm>
                           <a:off x="0" y="0"/>
-                          <a:ext cx="4730115" cy="9767570"/>
+                          <a:ext cx="4730115" cy="9174480"/>
                         </a:xfrm>
                         <a:prstGeom prst="rect">
                           <a:avLst/>
@@ -8715,7 +11045,7 @@
           </mc:Choice>
           <mc:Fallback>
             <w:pict>
-              <v:shape w14:anchorId="11308E57" id="Text Box 999919709" o:spid="_x0000_s1035" type="#_x0000_t202" style="position:absolute;margin-left:159.6pt;margin-top:10.2pt;width:372.45pt;height:769.1pt;z-index:251725824;visibility:visible;mso-wrap-style:square;mso-width-percent:0;mso-height-percent:0;mso-wrap-distance-left:9pt;mso-wrap-distance-top:3.6pt;mso-wrap-distance-right:9pt;mso-wrap-distance-bottom:3.6pt;mso-position-horizontal:absolute;mso-position-horizontal-relative:margin;mso-position-vertical:absolute;mso-position-vertical-relative:page;mso-width-percent:0;mso-height-percent:0;mso-width-relative:margin;mso-height-relative:margin;v-text-anchor:top" o:gfxdata="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" filled="f" stroked="f">
+              <v:shape w14:anchorId="11308E57" id="Text Box 999919709" o:spid="_x0000_s1036" type="#_x0000_t202" style="position:absolute;margin-left:159.6pt;margin-top:0;width:372.45pt;height:722.4pt;z-index:251725824;visibility:visible;mso-wrap-style:square;mso-width-percent:0;mso-height-percent:0;mso-wrap-distance-left:9pt;mso-wrap-distance-top:3.6pt;mso-wrap-distance-right:9pt;mso-wrap-distance-bottom:3.6pt;mso-position-horizontal:absolute;mso-position-horizontal-relative:margin;mso-position-vertical:top;mso-position-vertical-relative:margin;mso-width-percent:0;mso-height-percent:0;mso-width-relative:margin;mso-height-relative:margin;v-text-anchor:top" o:gfxdata="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" filled="f" stroked="f">
                 <v:textbox>
                   <w:txbxContent>
                     <w:p>
@@ -8911,8 +11241,21 @@
                           <w:szCs w:val="24"/>
                           <w:lang w:val="fr-FR" w:eastAsia="fr-FR"/>
                         </w:rPr>
-                        <w:t>Consulting Resident Engineer</w:t>
-                      </w:r>
+                        <w:t xml:space="preserve">Consulting Resident </w:t>
+                      </w:r>
+                      <w:proofErr w:type="spellStart"/>
+                      <w:r>
+                        <w:rPr>
+                          <w:rFonts w:ascii="Arial Narrow" w:eastAsia="Times New Roman" w:hAnsi="Arial Narrow" w:cs="Times New Roman"/>
+                          <w:b/>
+                          <w:bCs/>
+                          <w:sz w:val="24"/>
+                          <w:szCs w:val="24"/>
+                          <w:lang w:val="fr-FR" w:eastAsia="fr-FR"/>
+                        </w:rPr>
+                        <w:t>Engineer</w:t>
+                      </w:r>
+                      <w:proofErr w:type="spellEnd"/>
                     </w:p>
                     <w:p>
                       <w:pPr>
@@ -8983,18 +11326,7 @@
                           <w:szCs w:val="24"/>
                           <w:lang w:val="en-GB" w:eastAsia="fr-FR"/>
                         </w:rPr>
-                        <w:t xml:space="preserve">Assisting the Team Leader in the review of cost estimates, modification of designs, standardization of quality control </w:t>
-                      </w:r>
-                      <w:r>
-                        <w:rPr>
-                          <w:rFonts w:ascii="Arial Narrow" w:eastAsia="Times New Roman" w:hAnsi="Arial Narrow"/>
-                          <w:bCs/>
-                          <w:snapToGrid w:val="0"/>
-                          <w:sz w:val="24"/>
-                          <w:szCs w:val="24"/>
-                          <w:lang w:val="en-GB" w:eastAsia="fr-FR"/>
-                        </w:rPr>
-                        <w:t>pro</w:t>
+                        <w:t>Assisting the Team Leader in the review of cost estimates, modification of designs, standardization of quality control pro</w:t>
                       </w:r>
                       <w:r>
                         <w:rPr>
@@ -9148,7 +11480,23 @@
                           <w:b/>
                           <w:bCs/>
                         </w:rPr>
-                        <w:t>Design Review and Construction Supervision of Rehabilitation and Upgrading of Dodo Pepesu – Nkwanta Road (46.4 km) in Ghana (Eastern Corridor Roads)</w:t>
+                        <w:t xml:space="preserve">Design Review and Construction Supervision of Rehabilitation and Upgrading of Dodo </w:t>
+                      </w:r>
+                      <w:proofErr w:type="spellStart"/>
+                      <w:r>
+                        <w:rPr>
+                          <w:b/>
+                          <w:bCs/>
+                        </w:rPr>
+                        <w:t>Pepesu</w:t>
+                      </w:r>
+                      <w:proofErr w:type="spellEnd"/>
+                      <w:r>
+                        <w:rPr>
+                          <w:b/>
+                          <w:bCs/>
+                        </w:rPr>
+                        <w:t xml:space="preserve"> – Nkwanta Road (46.4 km) in Ghana (Eastern Corridor Roads)</w:t>
                       </w:r>
                       <w:r>
                         <w:rPr>
@@ -9201,7 +11549,7 @@
                           <w:szCs w:val="24"/>
                           <w:lang w:val="en-GB"/>
                         </w:rPr>
-                        <w:t>Am Responsible for all necessary Design Changes, project management.</w:t>
+                        <w:t xml:space="preserve">Am Responsible for all necessary Design Changes, project management. I am also responsible for Contract administration of the project, coordinating with a team of engineers. Monitoring all Contractual issues. Advising Team Leader/Resident Engineer on Claim Mitigation and Assessment Issues. </w:t>
                       </w:r>
                       <w:r>
                         <w:rPr>
@@ -9210,7 +11558,7 @@
                           <w:szCs w:val="24"/>
                           <w:lang w:val="en-GB"/>
                         </w:rPr>
-                        <w:t xml:space="preserve"> </w:t>
+                        <w:t>Responsible for all necessary Design Changes</w:t>
                       </w:r>
                       <w:r>
                         <w:rPr>
@@ -9219,7 +11567,7 @@
                           <w:szCs w:val="24"/>
                           <w:lang w:val="en-GB"/>
                         </w:rPr>
-                        <w:t>I am also responsible for Contract administration of the project, coordinating with a team of engineers.</w:t>
+                        <w:t xml:space="preserve"> and </w:t>
                       </w:r>
                       <w:r>
                         <w:rPr>
@@ -9228,7 +11576,7 @@
                           <w:szCs w:val="24"/>
                           <w:lang w:val="en-GB"/>
                         </w:rPr>
-                        <w:t xml:space="preserve"> </w:t>
+                        <w:t>project management.</w:t>
                       </w:r>
                       <w:r>
                         <w:rPr>
@@ -9237,151 +11585,7 @@
                           <w:szCs w:val="24"/>
                           <w:lang w:val="en-GB"/>
                         </w:rPr>
-                        <w:t>Monitoring all Contractual issues</w:t>
-                      </w:r>
-                      <w:r>
-                        <w:rPr>
-                          <w:rFonts w:ascii="Arial Narrow" w:hAnsi="Arial Narrow"/>
-                          <w:sz w:val="24"/>
-                          <w:szCs w:val="24"/>
-                          <w:lang w:val="en-GB"/>
-                        </w:rPr>
-                        <w:t xml:space="preserve">. </w:t>
-                      </w:r>
-                      <w:r>
-                        <w:rPr>
-                          <w:rFonts w:ascii="Arial Narrow" w:hAnsi="Arial Narrow"/>
-                          <w:sz w:val="24"/>
-                          <w:szCs w:val="24"/>
-                          <w:lang w:val="en-GB"/>
-                        </w:rPr>
-                        <w:t>Advising Team Leader/Resident Engineer on Claim Mitigation and Assessment Issues.</w:t>
-                      </w:r>
-                      <w:r>
-                        <w:rPr>
-                          <w:rFonts w:ascii="Arial Narrow" w:hAnsi="Arial Narrow"/>
-                          <w:sz w:val="24"/>
-                          <w:szCs w:val="24"/>
-                          <w:lang w:val="en-GB"/>
-                        </w:rPr>
-                        <w:t xml:space="preserve"> </w:t>
-                      </w:r>
-                      <w:r>
-                        <w:rPr>
-                          <w:rFonts w:ascii="Arial Narrow" w:hAnsi="Arial Narrow"/>
-                          <w:sz w:val="24"/>
-                          <w:szCs w:val="24"/>
-                          <w:lang w:val="en-GB"/>
-                        </w:rPr>
-                        <w:t>Responsible for all necessary Design Changes</w:t>
-                      </w:r>
-                      <w:r>
-                        <w:rPr>
-                          <w:rFonts w:ascii="Arial Narrow" w:hAnsi="Arial Narrow"/>
-                          <w:sz w:val="24"/>
-                          <w:szCs w:val="24"/>
-                          <w:lang w:val="en-GB"/>
-                        </w:rPr>
-                        <w:t xml:space="preserve"> and </w:t>
-                      </w:r>
-                      <w:r>
-                        <w:rPr>
-                          <w:rFonts w:ascii="Arial Narrow" w:hAnsi="Arial Narrow"/>
-                          <w:sz w:val="24"/>
-                          <w:szCs w:val="24"/>
-                          <w:lang w:val="en-GB"/>
-                        </w:rPr>
-                        <w:t>project management.</w:t>
-                      </w:r>
-                      <w:r>
-                        <w:rPr>
-                          <w:rFonts w:ascii="Arial Narrow" w:hAnsi="Arial Narrow"/>
-                          <w:sz w:val="24"/>
-                          <w:szCs w:val="24"/>
-                          <w:lang w:val="en-GB"/>
-                        </w:rPr>
-                        <w:t xml:space="preserve"> </w:t>
-                      </w:r>
-                      <w:r>
-                        <w:rPr>
-                          <w:rFonts w:ascii="Arial Narrow" w:hAnsi="Arial Narrow"/>
-                          <w:sz w:val="24"/>
-                          <w:szCs w:val="24"/>
-                          <w:lang w:val="en-GB"/>
-                        </w:rPr>
-                        <w:t>Assisting the Team Leader/Resident Engineer in the review of cost estimates.</w:t>
-                      </w:r>
-                      <w:r>
-                        <w:rPr>
-                          <w:rFonts w:ascii="Arial Narrow" w:hAnsi="Arial Narrow"/>
-                          <w:sz w:val="24"/>
-                          <w:szCs w:val="24"/>
-                          <w:lang w:val="en-GB"/>
-                        </w:rPr>
-                        <w:t xml:space="preserve"> </w:t>
-                      </w:r>
-                      <w:r>
-                        <w:rPr>
-                          <w:rFonts w:ascii="Arial Narrow" w:hAnsi="Arial Narrow"/>
-                          <w:sz w:val="24"/>
-                          <w:szCs w:val="24"/>
-                          <w:lang w:val="en-GB"/>
-                        </w:rPr>
-                        <w:t>Modification of designs, standardization of quality control procedures.</w:t>
-                      </w:r>
-                      <w:r>
-                        <w:rPr>
-                          <w:rFonts w:ascii="Arial Narrow" w:hAnsi="Arial Narrow"/>
-                          <w:sz w:val="24"/>
-                          <w:szCs w:val="24"/>
-                          <w:lang w:val="en-GB"/>
-                        </w:rPr>
-                        <w:t xml:space="preserve"> </w:t>
-                      </w:r>
-                      <w:r>
-                        <w:rPr>
-                          <w:rFonts w:ascii="Arial Narrow" w:hAnsi="Arial Narrow"/>
-                          <w:sz w:val="24"/>
-                          <w:szCs w:val="24"/>
-                          <w:lang w:val="en-GB"/>
-                        </w:rPr>
-                        <w:t>Monitoring and supervising contractor’s site works.</w:t>
-                      </w:r>
-                      <w:r>
-                        <w:rPr>
-                          <w:rFonts w:ascii="Arial Narrow" w:hAnsi="Arial Narrow"/>
-                          <w:sz w:val="24"/>
-                          <w:szCs w:val="24"/>
-                          <w:lang w:val="en-GB"/>
-                        </w:rPr>
-                        <w:t xml:space="preserve"> </w:t>
-                      </w:r>
-                      <w:r>
-                        <w:rPr>
-                          <w:rFonts w:ascii="Arial Narrow" w:hAnsi="Arial Narrow"/>
-                          <w:sz w:val="24"/>
-                          <w:szCs w:val="24"/>
-                          <w:lang w:val="en-GB"/>
-                        </w:rPr>
-                        <w:t>Reviewing the contractor’s operations and construction planning.</w:t>
-                      </w:r>
-                      <w:r>
-                        <w:rPr>
-                          <w:rFonts w:ascii="Arial Narrow" w:hAnsi="Arial Narrow"/>
-                          <w:sz w:val="24"/>
-                          <w:szCs w:val="24"/>
-                          <w:lang w:val="en-GB"/>
-                        </w:rPr>
-                        <w:t xml:space="preserve"> </w:t>
-                      </w:r>
-                      <w:r>
-                        <w:rPr>
-                          <w:rFonts w:ascii="Arial Narrow" w:hAnsi="Arial Narrow"/>
-                          <w:sz w:val="24"/>
-                          <w:szCs w:val="24"/>
-                          <w:lang w:val="en-GB"/>
-                        </w:rPr>
-                        <w:t>Assisting Team leader/Resident Engineer in financial control, Evaluation and assessment of Contractual payments/claims, variation orders, documentation and reporting.</w:t>
+                        <w:t xml:space="preserve"> Assisting the Team Leader/Resident Engineer in the review of cost estimates. Modification of designs, standardization of quality control procedures. Monitoring and supervising contractor’s site works. Reviewing the contractor’s operations and construction planning. Assisting Team leader/Resident Engineer in financial control, Evaluation and assessment of Contractual payments/claims, variation orders, documentation and reporting.</w:t>
                       </w:r>
                       <w:r>
                         <w:rPr>
@@ -9687,7 +11891,7 @@
                     </w:p>
                   </w:txbxContent>
                 </v:textbox>
-                <w10:wrap type="square" anchorx="margin" anchory="page"/>
+                <w10:wrap type="square" anchorx="margin" anchory="margin"/>
                 <w10:anchorlock/>
               </v:shape>
             </w:pict>
@@ -10002,7 +12206,7 @@
       <w:lvlText w:val=""/>
       <w:lvlJc w:val="left"/>
       <w:pPr>
-        <w:ind w:left="720" w:hanging="360"/>
+        <w:ind w:left="644" w:hanging="360"/>
       </w:pPr>
       <w:rPr>
         <w:rFonts w:ascii="Symbol" w:hAnsi="Symbol" w:hint="default"/>
@@ -11955,6 +14159,7 @@
       <w:numPr>
         <w:numId w:val="5"/>
       </w:numPr>
+      <w:ind w:left="720"/>
     </w:pPr>
     <w:rPr>
       <w:position w:val="0"/>

</xml_diff>